<commit_message>
Fix Word form XML compatibility and formatting
Co-authored-by: arena-agent <297053741+arena-agent@users.noreply.github.com>
</commit_message>
<xml_diff>
--- a/公选课/《AI数字人短视频制作》课程标准-薛辉（校选）.docx
+++ b/公选课/《AI数字人短视频制作》课程标准-薛辉（校选）.docx
@@ -1,8 +1,8 @@
 
 <file path=word/document.xml><?xml version="1.0" encoding="utf-8"?>
-<w:document xmlns:mc="http://schemas.openxmlformats.org/markup-compatibility/2006" xmlns:ns2="http://schemas.microsoft.com/office/word/2010/wordml" xmlns:w="http://schemas.openxmlformats.org/wordprocessingml/2006/main" mc:Ignorable="w14 w15 w16se w16cid w16 w16cex w16sdtdh w16sdtfl w16du wp14">
+<w:document xmlns:wpc="http://schemas.microsoft.com/office/word/2010/wordprocessingCanvas" xmlns:cx="http://schemas.microsoft.com/office/drawing/2014/chartex" xmlns:cx1="http://schemas.microsoft.com/office/drawing/2015/9/8/chartex" xmlns:cx2="http://schemas.microsoft.com/office/drawing/2015/10/21/chartex" xmlns:cx3="http://schemas.microsoft.com/office/drawing/2016/5/9/chartex" xmlns:cx4="http://schemas.microsoft.com/office/drawing/2016/5/10/chartex" xmlns:cx5="http://schemas.microsoft.com/office/drawing/2016/5/11/chartex" xmlns:cx6="http://schemas.microsoft.com/office/drawing/2016/5/12/chartex" xmlns:cx7="http://schemas.microsoft.com/office/drawing/2016/5/13/chartex" xmlns:cx8="http://schemas.microsoft.com/office/drawing/2016/5/14/chartex" xmlns:mc="http://schemas.openxmlformats.org/markup-compatibility/2006" xmlns:aink="http://schemas.microsoft.com/office/drawing/2016/ink" xmlns:am3d="http://schemas.microsoft.com/office/drawing/2017/model3d" xmlns:o="urn:schemas-microsoft-com:office:office" xmlns:oel="http://schemas.microsoft.com/office/2019/extlst" xmlns:r="http://schemas.openxmlformats.org/officeDocument/2006/relationships" xmlns:m="http://schemas.openxmlformats.org/officeDocument/2006/math" xmlns:v="urn:schemas-microsoft-com:vml" xmlns:wp14="http://schemas.microsoft.com/office/word/2010/wordprocessingDrawing" xmlns:wp="http://schemas.openxmlformats.org/drawingml/2006/wordprocessingDrawing" xmlns:w10="urn:schemas-microsoft-com:office:word" xmlns:w="http://schemas.openxmlformats.org/wordprocessingml/2006/main" xmlns:w14="http://schemas.microsoft.com/office/word/2010/wordml" xmlns:w15="http://schemas.microsoft.com/office/word/2012/wordml" xmlns:w16cex="http://schemas.microsoft.com/office/word/2018/wordml/cex" xmlns:w16cid="http://schemas.microsoft.com/office/word/2016/wordml/cid" xmlns:w16="http://schemas.microsoft.com/office/word/2018/wordml" xmlns:w16du="http://schemas.microsoft.com/office/word/2023/wordml/word16du" xmlns:w16sdtdh="http://schemas.microsoft.com/office/word/2020/wordml/sdtdatahash" xmlns:w16sdtfl="http://schemas.microsoft.com/office/word/2024/wordml/sdtformatlock" xmlns:w16se="http://schemas.microsoft.com/office/word/2015/wordml/symex" xmlns:wpg="http://schemas.microsoft.com/office/word/2010/wordprocessingGroup" xmlns:wpi="http://schemas.microsoft.com/office/word/2010/wordprocessingInk" xmlns:wne="http://schemas.microsoft.com/office/word/2006/wordml" xmlns:wps="http://schemas.microsoft.com/office/word/2010/wordprocessingShape" mc:Ignorable="w14 w15 w16se w16cid w16 w16cex w16sdtdh w16sdtfl w16du wp14">
   <w:body>
-    <w:p ns2:paraId="258F6513" ns2:textId="77777777">
+    <w:p>
       <w:pPr>
         <w:adjustRightInd w:val="0"/>
         <w:snapToGrid w:val="0"/>
@@ -24,7 +24,7 @@
         <w:t>附件1：</w:t>
       </w:r>
     </w:p>
-    <w:p ns2:paraId="09255D87" ns2:textId="4B8CF9B4">
+    <w:p>
       <w:pPr>
         <w:adjustRightInd w:val="0"/>
         <w:snapToGrid w:val="0"/>
@@ -66,7 +66,7 @@
         <w:t/>
       </w:r>
     </w:p>
-    <w:p ns2:paraId="7981AC6D" ns2:textId="77777777">
+    <w:p>
       <w:pPr>
         <w:adjustRightInd w:val="0"/>
         <w:snapToGrid w:val="0"/>
@@ -87,7 +87,7 @@
         <w:t xml:space="preserve">课程编码：                          </w:t>
       </w:r>
     </w:p>
-    <w:p ns2:paraId="7EC0CE20" ns2:textId="47DCD1B3">
+    <w:p>
       <w:pPr>
         <w:adjustRightInd w:val="0"/>
         <w:snapToGrid w:val="0"/>
@@ -239,7 +239,7 @@
         <w:t xml:space="preserve"/>
       </w:r>
     </w:p>
-    <w:p ns2:paraId="45B09DA2" ns2:textId="7D65A5C7">
+    <w:p>
       <w:pPr>
         <w:adjustRightInd w:val="0"/>
         <w:snapToGrid w:val="0"/>
@@ -310,7 +310,7 @@
         <w:t/>
       </w:r>
     </w:p>
-    <w:p ns2:paraId="239C1B02" ns2:textId="77777777">
+    <w:p>
       <w:pPr>
         <w:adjustRightInd w:val="0"/>
         <w:snapToGrid w:val="0"/>
@@ -336,7 +336,7 @@
         <w:t xml:space="preserve">一、课程性质与作用</w:t>
       </w:r>
     </w:p>
-    <w:p ns2:paraId="64E19933" ns2:textId="77777777">
+    <w:p>
       <w:pPr>
         <w:pStyle w:val="2"/>
         <w:spacing w:line="500" w:lineRule="exact"/>
@@ -356,7 +356,7 @@
         <w:t xml:space="preserve">《AI数字人短视频制作》是面向全校各专业学生开设的公共选修课程。课程聚焦生成式人工智能支持下的数字人短视频策划、制作与传播，突出脚本设计、数字人驱动、剪辑包装和合规发布等实践环节，培养学生运用数字内容工具完成真实传播任务的能力。</w:t>
       </w:r>
     </w:p>
-    <w:p ns2:paraId="385EE347" ns2:textId="68E63155">
+    <w:p>
       <w:pPr>
         <w:pStyle w:val="2"/>
         <w:spacing w:line="500" w:lineRule="exact"/>
@@ -376,7 +376,7 @@
         <w:t xml:space="preserve">通过学习，学生能够完成从需求分析、脚本分镜到数字人视频输出与审核的基本流程，制作适用于校园宣传、专业介绍、知识讲解等场景的短视频，提升数字表达、审美判断、协作沟通和媒介素养。</w:t>
       </w:r>
     </w:p>
-    <w:p ns2:paraId="7937E873" ns2:textId="77777777">
+    <w:p>
       <w:pPr>
         <w:adjustRightInd w:val="0"/>
         <w:snapToGrid w:val="0"/>
@@ -402,7 +402,7 @@
         <w:t xml:space="preserve">二、课程设计思路</w:t>
       </w:r>
     </w:p>
-    <w:p ns2:paraId="70DD8B3F" ns2:textId="2249DD23">
+    <w:p>
       <w:pPr>
         <w:spacing w:line="500" w:lineRule="exact"/>
         <w:ind w:firstLineChars="200" w:firstLine="482"/>
@@ -450,7 +450,7 @@
         <w:t/>
       </w:r>
     </w:p>
-    <w:p ns2:paraId="7E33D94F" ns2:textId="77777777">
+    <w:p>
       <w:pPr>
         <w:pStyle w:val="2"/>
         <w:spacing w:line="500" w:lineRule="exact"/>
@@ -470,7 +470,7 @@
         <w:t xml:space="preserve">课程坚持学生中心、产出导向、持续改进，落实立德树人要求，以真实传播任务为牵引，遵循“策划—创作—制作—审核—发布”的工作流程，将技术训练、内容责任、版权意识和职业素养有机融合。</w:t>
       </w:r>
     </w:p>
-    <w:p ns2:paraId="26249B6B" ns2:textId="7538EF9A">
+    <w:p>
       <w:pPr>
         <w:spacing w:line="500" w:lineRule="exact"/>
         <w:ind w:firstLineChars="200" w:firstLine="482"/>
@@ -518,7 +518,7 @@
         <w:t/>
       </w:r>
     </w:p>
-    <w:p ns2:paraId="656B2B1D" ns2:textId="77777777">
+    <w:p>
       <w:pPr>
         <w:pStyle w:val="2"/>
         <w:spacing w:line="500" w:lineRule="exact"/>
@@ -574,7 +574,7 @@
         <w:t/>
       </w:r>
     </w:p>
-    <w:p ns2:paraId="5B61F02B" ns2:textId="77777777">
+    <w:p>
       <w:pPr>
         <w:spacing w:line="500" w:lineRule="exact"/>
         <w:ind w:firstLineChars="200" w:firstLine="482"/>
@@ -598,7 +598,7 @@
         <w:t xml:space="preserve">1. 教学内容确定的依据</w:t>
       </w:r>
     </w:p>
-    <w:p ns2:paraId="57478C65" ns2:textId="738C727E">
+    <w:p>
       <w:pPr>
         <w:pStyle w:val="2"/>
         <w:spacing w:line="500" w:lineRule="exact"/>
@@ -723,7 +723,7 @@
         <w:t/>
       </w:r>
     </w:p>
-    <w:p ns2:paraId="6EE1D24F" ns2:textId="77777777">
+    <w:p>
       <w:pPr>
         <w:pStyle w:val="2"/>
         <w:spacing w:line="500" w:lineRule="exact"/>
@@ -743,7 +743,7 @@
         <w:t xml:space="preserve">岗位导向：衔接数字内容策划、短视频制作、新媒体运营等岗位所需的基础表达与制作能力。</w:t>
       </w:r>
     </w:p>
-    <w:p ns2:paraId="684E15CF" ns2:textId="77777777">
+    <w:p>
       <w:pPr>
         <w:pStyle w:val="2"/>
         <w:spacing w:line="500" w:lineRule="exact"/>
@@ -763,7 +763,7 @@
         <w:t xml:space="preserve">技术与规范导向：选择适用的数字人及视频工具，关注平台变化、内容真实性、肖像声音授权、版权和合成内容标识。</w:t>
       </w:r>
     </w:p>
-    <w:p ns2:paraId="16A7A2CF" ns2:textId="77777777">
+    <w:p>
       <w:pPr>
         <w:spacing w:line="500" w:lineRule="exact"/>
         <w:ind w:firstLineChars="200" w:firstLine="482"/>
@@ -787,7 +787,7 @@
         <w:t xml:space="preserve">2. 教学内容组织</w:t>
       </w:r>
     </w:p>
-    <w:p ns2:paraId="381D954C" ns2:textId="77777777">
+    <w:p>
       <w:pPr>
         <w:pStyle w:val="2"/>
         <w:spacing w:line="500" w:lineRule="exact"/>
@@ -807,7 +807,7 @@
         <w:t xml:space="preserve">课程按“认知策划—素材准备—数字人制作—视听包装—综合交付”的认知与工作流程组织：</w:t>
       </w:r>
     </w:p>
-    <w:p ns2:paraId="61F563FE" ns2:textId="270179FD">
+    <w:p>
       <w:pPr>
         <w:pStyle w:val="2"/>
         <w:spacing w:line="500" w:lineRule="exact"/>
@@ -877,7 +877,7 @@
         <w:t/>
       </w:r>
     </w:p>
-    <w:p ns2:paraId="1E09E9E2" ns2:textId="7F4F1A5B">
+    <w:p>
       <w:pPr>
         <w:pStyle w:val="2"/>
         <w:spacing w:line="500" w:lineRule="exact"/>
@@ -929,7 +929,7 @@
         <w:t/>
       </w:r>
     </w:p>
-    <w:p ns2:paraId="7D5E3813" ns2:textId="77777777">
+    <w:p>
       <w:pPr>
         <w:pStyle w:val="2"/>
         <w:spacing w:line="500" w:lineRule="exact"/>
@@ -967,7 +967,7 @@
         <w:t/>
       </w:r>
     </w:p>
-    <w:p ns2:paraId="229A1ADA" ns2:textId="274993DA">
+    <w:p>
       <w:pPr>
         <w:pStyle w:val="2"/>
         <w:spacing w:line="500" w:lineRule="exact"/>
@@ -1019,7 +1019,7 @@
         <w:t/>
       </w:r>
     </w:p>
-    <w:p ns2:paraId="0D04F10B" ns2:textId="77777777">
+    <w:p>
       <w:pPr>
         <w:spacing w:line="500" w:lineRule="exact"/>
         <w:ind w:firstLineChars="200" w:firstLine="482"/>
@@ -1043,7 +1043,7 @@
         <w:t xml:space="preserve">3. 教学模式及教学方法设计</w:t>
       </w:r>
     </w:p>
-    <w:p ns2:paraId="119FF04A" ns2:textId="77777777">
+    <w:p>
       <w:pPr>
         <w:pStyle w:val="2"/>
         <w:spacing w:line="500" w:lineRule="exact"/>
@@ -1063,7 +1063,7 @@
         <w:t xml:space="preserve">采用任务驱动与项目导向相结合的教学模式，实施“教、学、做、评”一体化教学。</w:t>
       </w:r>
     </w:p>
-    <w:p ns2:paraId="3FD210B0" ns2:textId="77777777">
+    <w:p>
       <w:pPr>
         <w:pStyle w:val="2"/>
         <w:spacing w:line="500" w:lineRule="exact"/>
@@ -1083,7 +1083,7 @@
         <w:t xml:space="preserve">教学方法:</w:t>
       </w:r>
     </w:p>
-    <w:p ns2:paraId="78D7068D" ns2:textId="77777777">
+    <w:p>
       <w:pPr>
         <w:pStyle w:val="2"/>
         <w:spacing w:line="500" w:lineRule="exact"/>
@@ -1103,7 +1103,7 @@
         <w:t xml:space="preserve">真实任务教学法：以校园活动宣传、专业介绍和知识讲解等场景为任务载体。</w:t>
       </w:r>
     </w:p>
-    <w:p ns2:paraId="6C234E86" ns2:textId="75A0AFDD">
+    <w:p>
       <w:pPr>
         <w:pStyle w:val="2"/>
         <w:spacing w:line="500" w:lineRule="exact"/>
@@ -1179,7 +1179,7 @@
         <w:t/>
       </w:r>
     </w:p>
-    <w:p ns2:paraId="21885BE6" ns2:textId="271DA44D">
+    <w:p>
       <w:pPr>
         <w:pStyle w:val="2"/>
         <w:spacing w:line="500" w:lineRule="exact"/>
@@ -1255,7 +1255,7 @@
         <w:t/>
       </w:r>
     </w:p>
-    <w:p ns2:paraId="073A4BB8" ns2:textId="77777777">
+    <w:p>
       <w:pPr>
         <w:pStyle w:val="2"/>
         <w:spacing w:line="500" w:lineRule="exact"/>
@@ -1275,7 +1275,7 @@
         <w:t xml:space="preserve">案例教学法：分析优秀作品及问题案例，训练内容判断、审美和合规意识。</w:t>
       </w:r>
     </w:p>
-    <w:p ns2:paraId="6277780E" ns2:textId="77777777">
+    <w:p>
       <w:pPr>
         <w:spacing w:line="500" w:lineRule="exact"/>
         <w:ind w:firstLineChars="200" w:firstLine="482"/>
@@ -1321,7 +1321,7 @@
         <w:t/>
       </w:r>
     </w:p>
-    <w:p ns2:paraId="1C45A35B" ns2:textId="77777777">
+    <w:p>
       <w:pPr>
         <w:pStyle w:val="2"/>
         <w:spacing w:line="500" w:lineRule="exact"/>
@@ -1341,7 +1341,7 @@
         <w:t xml:space="preserve">真实诚信：不得伪造事实或冒用他人形象、声音；使用生成式AI应按要求说明。</w:t>
       </w:r>
     </w:p>
-    <w:p ns2:paraId="36988D9C" ns2:textId="77777777">
+    <w:p>
       <w:pPr>
         <w:pStyle w:val="2"/>
         <w:spacing w:line="500" w:lineRule="exact"/>
@@ -1361,7 +1361,7 @@
         <w:t xml:space="preserve">版权与人格权：落实图片、音乐、字体及肖像、声音的授权核验，尊重原创与个人权益。</w:t>
       </w:r>
     </w:p>
-    <w:p ns2:paraId="157D7251" ns2:textId="77777777">
+    <w:p>
       <w:pPr>
         <w:pStyle w:val="2"/>
         <w:spacing w:line="500" w:lineRule="exact"/>
@@ -1381,7 +1381,7 @@
         <w:t xml:space="preserve">数据与隐私：不在未经授权的平台上传个人敏感信息、未公开业务资料或他人影像。</w:t>
       </w:r>
     </w:p>
-    <w:p ns2:paraId="08973C56" ns2:textId="77777777">
+    <w:p>
       <w:pPr>
         <w:pStyle w:val="2"/>
         <w:spacing w:line="500" w:lineRule="exact"/>
@@ -1401,7 +1401,7 @@
         <w:t xml:space="preserve">技术向善：关注数字人技术对传播生态的影响，合理使用国产和合规工具。</w:t>
       </w:r>
     </w:p>
-    <w:p ns2:paraId="2CF2577B" ns2:textId="77777777">
+    <w:p>
       <w:pPr>
         <w:pStyle w:val="2"/>
         <w:spacing w:line="500" w:lineRule="exact"/>
@@ -1421,7 +1421,7 @@
         <w:t xml:space="preserve">职业素养：培养严谨核查、按时交付、团队协作和对传播后果负责的意识。</w:t>
       </w:r>
     </w:p>
-    <w:p ns2:paraId="350BDBBE" ns2:textId="77777777">
+    <w:p>
       <w:pPr>
         <w:adjustRightInd w:val="0"/>
         <w:snapToGrid w:val="0"/>
@@ -1447,7 +1447,7 @@
         <w:t xml:space="preserve">三、课程目标</w:t>
       </w:r>
     </w:p>
-    <w:p ns2:paraId="22F9EAC8" ns2:textId="1E1BB813">
+    <w:p>
       <w:pPr>
         <w:spacing w:line="500" w:lineRule="exact"/>
         <w:ind w:firstLineChars="200" w:firstLine="482"/>
@@ -1496,7 +1496,7 @@
         <w:t/>
       </w:r>
     </w:p>
-    <w:p ns2:paraId="68B0BD91" ns2:textId="77777777">
+    <w:p>
       <w:pPr>
         <w:pStyle w:val="2"/>
         <w:spacing w:line="500" w:lineRule="exact"/>
@@ -1516,7 +1516,7 @@
         <w:t xml:space="preserve">通过本课程学习与实践，使学生掌握数字人短视频制作的基础流程，能够针对具体传播需求完成选题策划、脚本分镜、数字人驱动、剪辑包装和合规检查，形成可展示、可评价的作品。</w:t>
       </w:r>
     </w:p>
-    <w:p ns2:paraId="5F654561" ns2:textId="259CBB71">
+    <w:p>
       <w:pPr>
         <w:spacing w:line="500" w:lineRule="exact"/>
         <w:ind w:firstLineChars="200" w:firstLine="482"/>
@@ -1564,7 +1564,7 @@
         <w:t/>
       </w:r>
     </w:p>
-    <w:p ns2:paraId="4B23950C" ns2:textId="77777777">
+    <w:p>
       <w:pPr>
         <w:spacing w:line="500" w:lineRule="exact"/>
         <w:ind w:firstLineChars="200" w:firstLine="482"/>
@@ -1588,7 +1588,7 @@
         <w:t xml:space="preserve">1. 知识目标</w:t>
       </w:r>
     </w:p>
-    <w:p ns2:paraId="2F19BC09" ns2:textId="1F67AA33">
+    <w:p>
       <w:pPr>
         <w:pStyle w:val="2"/>
         <w:spacing w:line="500" w:lineRule="exact"/>
@@ -1632,7 +1632,7 @@
         <w:t/>
       </w:r>
     </w:p>
-    <w:p ns2:paraId="094F7479" ns2:textId="7DF72391">
+    <w:p>
       <w:pPr>
         <w:pStyle w:val="2"/>
         <w:spacing w:line="500" w:lineRule="exact"/>
@@ -1676,7 +1676,7 @@
         <w:t/>
       </w:r>
     </w:p>
-    <w:p ns2:paraId="4833F935" ns2:textId="15162FD6">
+    <w:p>
       <w:pPr>
         <w:pStyle w:val="2"/>
         <w:spacing w:line="500" w:lineRule="exact"/>
@@ -1720,7 +1720,7 @@
         <w:t/>
       </w:r>
     </w:p>
-    <w:p ns2:paraId="0CEC4963" ns2:textId="20FF3F25">
+    <w:p>
       <w:pPr>
         <w:pStyle w:val="2"/>
         <w:spacing w:line="500" w:lineRule="exact"/>
@@ -1764,7 +1764,7 @@
         <w:t/>
       </w:r>
     </w:p>
-    <w:p ns2:paraId="5FC81A5A" ns2:textId="77777777">
+    <w:p>
       <w:pPr>
         <w:spacing w:line="500" w:lineRule="exact"/>
         <w:ind w:firstLineChars="200" w:firstLine="482"/>
@@ -1788,7 +1788,7 @@
         <w:t xml:space="preserve">2. 能力目标</w:t>
       </w:r>
     </w:p>
-    <w:p ns2:paraId="1AA7E22A" ns2:textId="04963C04">
+    <w:p>
       <w:pPr>
         <w:pStyle w:val="2"/>
         <w:spacing w:line="500" w:lineRule="exact"/>
@@ -1832,7 +1832,7 @@
         <w:t/>
       </w:r>
     </w:p>
-    <w:p ns2:paraId="359C1536" ns2:textId="31012EF6">
+    <w:p>
       <w:pPr>
         <w:pStyle w:val="2"/>
         <w:spacing w:line="500" w:lineRule="exact"/>
@@ -1876,7 +1876,7 @@
         <w:t/>
       </w:r>
     </w:p>
-    <w:p ns2:paraId="3FE69C0C" ns2:textId="066B305D">
+    <w:p>
       <w:pPr>
         <w:pStyle w:val="2"/>
         <w:spacing w:line="500" w:lineRule="exact"/>
@@ -1920,7 +1920,7 @@
         <w:t/>
       </w:r>
     </w:p>
-    <w:p ns2:paraId="0CFD53A0" ns2:textId="64554599">
+    <w:p>
       <w:pPr>
         <w:pStyle w:val="2"/>
         <w:spacing w:line="500" w:lineRule="exact"/>
@@ -1964,7 +1964,7 @@
         <w:t/>
       </w:r>
     </w:p>
-    <w:p ns2:paraId="6D7DDDBD" ns2:textId="7D53AFDA">
+    <w:p>
       <w:pPr>
         <w:pStyle w:val="2"/>
         <w:spacing w:line="500" w:lineRule="exact"/>
@@ -2008,7 +2008,7 @@
         <w:t/>
       </w:r>
     </w:p>
-    <w:p ns2:paraId="10B099D8" ns2:textId="7EEEC3F9">
+    <w:p>
       <w:pPr>
         <w:pStyle w:val="2"/>
         <w:spacing w:line="500" w:lineRule="exact"/>
@@ -2052,7 +2052,7 @@
         <w:t/>
       </w:r>
     </w:p>
-    <w:p ns2:paraId="620AA272" ns2:textId="12B93609">
+    <w:p>
       <w:pPr>
         <w:pStyle w:val="2"/>
         <w:spacing w:line="500" w:lineRule="exact"/>
@@ -2120,7 +2120,7 @@
         <w:t/>
       </w:r>
     </w:p>
-    <w:p ns2:paraId="4D06EB58" ns2:textId="77777777">
+    <w:p>
       <w:pPr>
         <w:spacing w:line="500" w:lineRule="exact"/>
         <w:ind w:firstLineChars="200" w:firstLine="482"/>
@@ -2144,7 +2144,7 @@
         <w:t xml:space="preserve">3. 素质目标</w:t>
       </w:r>
     </w:p>
-    <w:p ns2:paraId="1D7F7972" ns2:textId="418B7995">
+    <w:p>
       <w:pPr>
         <w:pStyle w:val="2"/>
         <w:spacing w:line="500" w:lineRule="exact"/>
@@ -2188,7 +2188,7 @@
         <w:t/>
       </w:r>
     </w:p>
-    <w:p ns2:paraId="3E62C229" ns2:textId="647E8146">
+    <w:p>
       <w:pPr>
         <w:pStyle w:val="2"/>
         <w:spacing w:line="500" w:lineRule="exact"/>
@@ -2232,7 +2232,7 @@
         <w:t/>
       </w:r>
     </w:p>
-    <w:p ns2:paraId="6DBF7E20" ns2:textId="7833C865">
+    <w:p>
       <w:pPr>
         <w:pStyle w:val="2"/>
         <w:spacing w:line="500" w:lineRule="exact"/>
@@ -2276,7 +2276,7 @@
         <w:t/>
       </w:r>
     </w:p>
-    <w:p ns2:paraId="66568CA8" ns2:textId="73A13212">
+    <w:p>
       <w:pPr>
         <w:pStyle w:val="2"/>
         <w:spacing w:line="500" w:lineRule="exact"/>
@@ -2320,7 +2320,7 @@
         <w:t/>
       </w:r>
     </w:p>
-    <w:p ns2:paraId="215EECC3" ns2:textId="5EEE2952">
+    <w:p>
       <w:pPr>
         <w:pStyle w:val="2"/>
         <w:spacing w:line="500" w:lineRule="exact"/>
@@ -2364,7 +2364,7 @@
         <w:t/>
       </w:r>
     </w:p>
-    <w:p ns2:paraId="51ADC59D" ns2:textId="22B8FA4B">
+    <w:p>
       <w:pPr>
         <w:pStyle w:val="2"/>
         <w:spacing w:line="500" w:lineRule="exact"/>
@@ -2408,7 +2408,7 @@
         <w:t/>
       </w:r>
     </w:p>
-    <w:p ns2:paraId="436C3CB9" ns2:textId="77777777">
+    <w:p>
       <w:pPr>
         <w:adjustRightInd w:val="0"/>
         <w:snapToGrid w:val="0"/>
@@ -2434,7 +2434,7 @@
         <w:t xml:space="preserve">四、课程内容和要求</w:t>
       </w:r>
     </w:p>
-    <w:p ns2:paraId="2A624C77" ns2:textId="77777777">
+    <w:p>
       <w:pPr>
         <w:pStyle w:val="2"/>
         <w:spacing w:line="500" w:lineRule="exact"/>
@@ -2455,7 +2455,7 @@
         <w:t xml:space="preserve">详见附表《课程内容与教学要求》</w:t>
       </w:r>
     </w:p>
-    <w:p ns2:paraId="0EFA746A" ns2:textId="77777777">
+    <w:p>
       <w:pPr>
         <w:adjustRightInd w:val="0"/>
         <w:snapToGrid w:val="0"/>
@@ -2481,7 +2481,7 @@
         <w:t xml:space="preserve">五、教学实施建议</w:t>
       </w:r>
     </w:p>
-    <w:p ns2:paraId="3950C48D" ns2:textId="59280CE4">
+    <w:p>
       <w:pPr>
         <w:spacing w:line="500" w:lineRule="exact"/>
         <w:ind w:firstLineChars="200" w:firstLine="482"/>
@@ -2532,7 +2532,7 @@
         <w:t/>
       </w:r>
     </w:p>
-    <w:p ns2:paraId="6A9117FB" ns2:textId="5AD8BE69">
+    <w:p>
       <w:pPr>
         <w:pStyle w:val="2"/>
         <w:spacing w:line="500" w:lineRule="exact"/>
@@ -2576,7 +2576,7 @@
         <w:t/>
       </w:r>
     </w:p>
-    <w:p ns2:paraId="5B51F251" ns2:textId="50B23B5A">
+    <w:p>
       <w:pPr>
         <w:pStyle w:val="2"/>
         <w:spacing w:line="500" w:lineRule="exact"/>
@@ -2620,7 +2620,7 @@
         <w:t/>
       </w:r>
     </w:p>
-    <w:p ns2:paraId="71C9EA1C" ns2:textId="53352798">
+    <w:p>
       <w:pPr>
         <w:pStyle w:val="2"/>
         <w:spacing w:line="500" w:lineRule="exact"/>
@@ -2664,7 +2664,7 @@
         <w:t/>
       </w:r>
     </w:p>
-    <w:p ns2:paraId="6A272875" ns2:textId="700503BC">
+    <w:p>
       <w:pPr>
         <w:pStyle w:val="2"/>
         <w:spacing w:line="500" w:lineRule="exact"/>
@@ -2708,7 +2708,7 @@
         <w:t/>
       </w:r>
     </w:p>
-    <w:p ns2:paraId="7B480D1B" ns2:textId="778A30DA">
+    <w:p>
       <w:pPr>
         <w:pStyle w:val="2"/>
         <w:spacing w:line="500" w:lineRule="exact"/>
@@ -2752,7 +2752,7 @@
         <w:t/>
       </w:r>
     </w:p>
-    <w:p ns2:paraId="162BC7A3" ns2:textId="7A868867">
+    <w:p>
       <w:pPr>
         <w:spacing w:line="500" w:lineRule="exact"/>
         <w:ind w:firstLineChars="200" w:firstLine="482"/>
@@ -2825,7 +2825,7 @@
         <w:t/>
       </w:r>
     </w:p>
-    <w:p ns2:paraId="28967163" ns2:textId="77777777">
+    <w:p>
       <w:pPr>
         <w:pStyle w:val="2"/>
         <w:spacing w:line="500" w:lineRule="exact"/>
@@ -2863,7 +2863,7 @@
         <w:t/>
       </w:r>
     </w:p>
-    <w:p ns2:paraId="2E88AD25" ns2:textId="77777777">
+    <w:p>
       <w:pPr>
         <w:pStyle w:val="2"/>
         <w:spacing w:line="500" w:lineRule="exact"/>
@@ -2883,7 +2883,7 @@
         <w:t xml:space="preserve">配备联网计算机或可满足实训的移动终端，保障网络和投影演示条件。</w:t>
       </w:r>
     </w:p>
-    <w:p ns2:paraId="4C673789" ns2:textId="6FCBEED7">
+    <w:p>
       <w:pPr>
         <w:pStyle w:val="2"/>
         <w:spacing w:line="500" w:lineRule="exact"/>
@@ -2935,7 +2935,7 @@
         <w:t/>
       </w:r>
     </w:p>
-    <w:p ns2:paraId="2ECA6D78" ns2:textId="77777777">
+    <w:p>
       <w:pPr>
         <w:pStyle w:val="2"/>
         <w:spacing w:line="500" w:lineRule="exact"/>
@@ -2973,7 +2973,7 @@
         <w:t/>
       </w:r>
     </w:p>
-    <w:p ns2:paraId="26D6613F" ns2:textId="77777777">
+    <w:p>
       <w:pPr>
         <w:pStyle w:val="2"/>
         <w:spacing w:line="500" w:lineRule="exact"/>
@@ -2993,7 +2993,7 @@
         <w:t xml:space="preserve">依托在线教学平台发布任务工单、素材规范、评价量规和学习资源。</w:t>
       </w:r>
     </w:p>
-    <w:p ns2:paraId="095D80C3" ns2:textId="77777777">
+    <w:p>
       <w:pPr>
         <w:pStyle w:val="2"/>
         <w:spacing w:line="500" w:lineRule="exact"/>
@@ -3031,7 +3031,7 @@
         <w:t/>
       </w:r>
     </w:p>
-    <w:p ns2:paraId="63216845" ns2:textId="77777777">
+    <w:p>
       <w:pPr>
         <w:pStyle w:val="2"/>
         <w:spacing w:line="500" w:lineRule="exact"/>
@@ -3051,7 +3051,7 @@
         <w:t xml:space="preserve">可结合校内宣传、专业文化建设等真实需求开展项目；使用真实业务素材须经授权和脱敏。</w:t>
       </w:r>
     </w:p>
-    <w:p ns2:paraId="13A9F816" ns2:textId="77777777">
+    <w:p>
       <w:pPr>
         <w:pStyle w:val="2"/>
         <w:spacing w:line="500" w:lineRule="exact"/>
@@ -3071,7 +3071,7 @@
         <w:t xml:space="preserve">可与校内宣传、融媒体或相关企业开展案例交流，不将合作资源作为课程开设的前置条件。</w:t>
       </w:r>
     </w:p>
-    <w:p ns2:paraId="7A9F0F5F" ns2:textId="77777777">
+    <w:p>
       <w:pPr>
         <w:pStyle w:val="2"/>
         <w:spacing w:line="500" w:lineRule="exact"/>
@@ -3091,7 +3091,7 @@
         <w:t xml:space="preserve">鼓励学生将合规作品用于校园活动或个人作品集，发布前履行审核流程。</w:t>
       </w:r>
     </w:p>
-    <w:p ns2:paraId="431DB63C" ns2:textId="6127EE7C">
+    <w:p>
       <w:pPr>
         <w:spacing w:line="500" w:lineRule="exact"/>
         <w:ind w:firstLineChars="200" w:firstLine="482"/>
@@ -3142,7 +3142,7 @@
         <w:t/>
       </w:r>
     </w:p>
-    <w:p ns2:paraId="65E4E60C" ns2:textId="179E8A8D">
+    <w:p>
       <w:pPr>
         <w:pStyle w:val="2"/>
         <w:spacing w:line="500" w:lineRule="exact"/>
@@ -3186,7 +3186,7 @@
         <w:t/>
       </w:r>
     </w:p>
-    <w:p ns2:paraId="195A5ACA" ns2:textId="0B3FEBF1">
+    <w:p>
       <w:pPr>
         <w:pStyle w:val="2"/>
         <w:spacing w:line="500" w:lineRule="exact"/>
@@ -3230,7 +3230,7 @@
         <w:t/>
       </w:r>
     </w:p>
-    <w:p ns2:paraId="3A59B799" ns2:textId="15F708C9">
+    <w:p>
       <w:pPr>
         <w:pStyle w:val="2"/>
         <w:spacing w:line="500" w:lineRule="exact"/>
@@ -3310,7 +3310,7 @@
         <w:t/>
       </w:r>
     </w:p>
-    <w:p ns2:paraId="1EE5359C" ns2:textId="6F74CC40">
+    <w:p>
       <w:pPr>
         <w:pStyle w:val="2"/>
         <w:spacing w:line="500" w:lineRule="exact"/>
@@ -3354,7 +3354,7 @@
         <w:t/>
       </w:r>
     </w:p>
-    <w:p ns2:paraId="5A467105" ns2:textId="3CC589A2">
+    <w:p>
       <w:pPr>
         <w:pStyle w:val="2"/>
         <w:spacing w:line="500" w:lineRule="exact"/>
@@ -3416,7 +3416,7 @@
         <w:t/>
       </w:r>
     </w:p>
-    <w:p ns2:paraId="5A6B748A" ns2:textId="1C2D988A">
+    <w:p>
       <w:pPr>
         <w:pStyle w:val="2"/>
         <w:spacing w:line="500" w:lineRule="exact"/>
@@ -3468,7 +3468,7 @@
         <w:t/>
       </w:r>
     </w:p>
-    <w:p ns2:paraId="6762BBB4" ns2:textId="77777777">
+    <w:p>
       <w:pPr>
         <w:pStyle w:val="2"/>
         <w:spacing w:line="500" w:lineRule="exact"/>
@@ -3488,7 +3488,7 @@
         <w:t xml:space="preserve">资源类型:</w:t>
       </w:r>
     </w:p>
-    <w:p ns2:paraId="51C7E5F8" ns2:textId="77777777">
+    <w:p>
       <w:pPr>
         <w:pStyle w:val="2"/>
         <w:spacing w:line="500" w:lineRule="exact"/>
@@ -3508,7 +3508,7 @@
         <w:t xml:space="preserve">视频资源：数字人平台操作示范、脚本拆解、剪辑流程与优秀作品案例</w:t>
       </w:r>
     </w:p>
-    <w:p ns2:paraId="7CCE456A" ns2:textId="77777777">
+    <w:p>
       <w:pPr>
         <w:pStyle w:val="2"/>
         <w:spacing w:line="500" w:lineRule="exact"/>
@@ -3546,7 +3546,7 @@
         <w:t/>
       </w:r>
     </w:p>
-    <w:p ns2:paraId="1049EA0C" ns2:textId="77777777">
+    <w:p>
       <w:pPr>
         <w:pStyle w:val="2"/>
         <w:spacing w:line="500" w:lineRule="exact"/>
@@ -3566,7 +3566,7 @@
         <w:t xml:space="preserve">案例资源：校园宣传、专业介绍、知识讲解等经授权或脱敏的案例</w:t>
       </w:r>
     </w:p>
-    <w:p ns2:paraId="7EA48F9E" ns2:textId="77777777">
+    <w:p>
       <w:pPr>
         <w:pStyle w:val="2"/>
         <w:spacing w:line="500" w:lineRule="exact"/>
@@ -3586,7 +3586,7 @@
         <w:t xml:space="preserve">工具资源：经审核可用的数字人、生成式AI和视频编辑工具指南</w:t>
       </w:r>
     </w:p>
-    <w:p ns2:paraId="0A26A89F" ns2:textId="77777777">
+    <w:p>
       <w:pPr>
         <w:pStyle w:val="2"/>
         <w:spacing w:line="500" w:lineRule="exact"/>
@@ -3606,7 +3606,7 @@
         <w:t xml:space="preserve">互动资源：作品交流区、同伴互评表、问题答疑与案例研讨</w:t>
       </w:r>
     </w:p>
-    <w:p ns2:paraId="081F97EF" ns2:textId="77777777">
+    <w:p>
       <w:pPr>
         <w:pStyle w:val="2"/>
         <w:spacing w:line="500" w:lineRule="exact"/>
@@ -3626,7 +3626,7 @@
         <w:t xml:space="preserve">资源利用:</w:t>
       </w:r>
     </w:p>
-    <w:p ns2:paraId="3F1459D5" ns2:textId="3B48EF83">
+    <w:p>
       <w:pPr>
         <w:pStyle w:val="2"/>
         <w:spacing w:line="500" w:lineRule="exact"/>
@@ -3670,7 +3670,7 @@
         <w:t/>
       </w:r>
     </w:p>
-    <w:p ns2:paraId="0AC70817" ns2:textId="77777777">
+    <w:p>
       <w:pPr>
         <w:pStyle w:val="2"/>
         <w:spacing w:line="500" w:lineRule="exact"/>
@@ -3690,7 +3690,7 @@
         <w:t xml:space="preserve">将操作要点、规范清单和案例整理为便于课前预习与课后复习的移动资源。</w:t>
       </w:r>
     </w:p>
-    <w:p ns2:paraId="108E0751" ns2:textId="77777777">
+    <w:p>
       <w:pPr>
         <w:pStyle w:val="2"/>
         <w:spacing w:line="500" w:lineRule="exact"/>
@@ -3710,7 +3710,7 @@
         <w:t xml:space="preserve">每学期依据平台变更、学生反馈和规范要求核查并更新课程资源。</w:t>
       </w:r>
     </w:p>
-    <w:p ns2:paraId="33BB614E" ns2:textId="77777777">
+    <w:p>
       <w:pPr>
         <w:pStyle w:val="2"/>
         <w:spacing w:line="500" w:lineRule="exact"/>
@@ -3730,7 +3730,7 @@
         <w:t xml:space="preserve">鼓励学生在授权和审核前提下分享优秀作品、制作心得与反思记录。</w:t>
       </w:r>
     </w:p>
-    <w:p ns2:paraId="3690ADA0" ns2:textId="77777777">
+    <w:p>
       <w:pPr>
         <w:pStyle w:val="2"/>
         <w:spacing w:line="500" w:lineRule="exact"/>
@@ -3762,13 +3762,13 @@
         <w:gridCol w:w="1130"/>
         <w:gridCol w:w="5491"/>
       </w:tblGrid>
-      <w:tr ns2:paraId="59F5399E" ns2:textId="77777777">
+      <w:tr>
         <w:tc>
           <w:tcPr>
             <w:tcW w:w="0" w:type="auto"/>
             <w:hideMark/>
           </w:tcPr>
-          <w:p ns2:paraId="6C15A697" ns2:textId="77777777">
+          <w:p>
             <w:pPr>
               <w:autoSpaceDE w:val="0"/>
               <w:autoSpaceDN w:val="0"/>
@@ -3794,7 +3794,7 @@
             <w:tcW w:w="0" w:type="auto"/>
             <w:hideMark/>
           </w:tcPr>
-          <w:p ns2:paraId="15A4F129" ns2:textId="77777777">
+          <w:p>
             <w:pPr>
               <w:widowControl/>
               <w:jc w:val="center"/>
@@ -3817,7 +3817,7 @@
             <w:tcW w:w="0" w:type="auto"/>
             <w:hideMark/>
           </w:tcPr>
-          <w:p ns2:paraId="73C46EF5" ns2:textId="77777777">
+          <w:p>
             <w:pPr>
               <w:widowControl/>
               <w:jc w:val="center"/>
@@ -3840,7 +3840,7 @@
             <w:tcW w:w="0" w:type="auto"/>
             <w:hideMark/>
           </w:tcPr>
-          <w:p ns2:paraId="51E1AEA1" ns2:textId="77777777">
+          <w:p>
             <w:pPr>
               <w:widowControl/>
               <w:jc w:val="center"/>
@@ -3859,13 +3859,13 @@
           </w:p>
         </w:tc>
       </w:tr>
-      <w:tr ns2:paraId="7377CB2B" ns2:textId="77777777">
+      <w:tr>
         <w:tc>
           <w:tcPr>
             <w:tcW w:w="0" w:type="auto"/>
             <w:hideMark/>
           </w:tcPr>
-          <w:p ns2:paraId="2FB04827" ns2:textId="77777777">
+          <w:p>
             <w:pPr>
               <w:autoSpaceDE w:val="0"/>
               <w:autoSpaceDN w:val="0"/>
@@ -3891,7 +3891,7 @@
             <w:tcW w:w="0" w:type="auto"/>
             <w:hideMark/>
           </w:tcPr>
-          <w:p ns2:paraId="18CCCD46" ns2:textId="77777777">
+          <w:p>
             <w:pPr>
               <w:autoSpaceDE w:val="0"/>
               <w:autoSpaceDN w:val="0"/>
@@ -3917,7 +3917,7 @@
             <w:tcW w:w="0" w:type="auto"/>
             <w:hideMark/>
           </w:tcPr>
-          <w:p ns2:paraId="03EBA663" ns2:textId="77777777">
+          <w:p>
             <w:pPr>
               <w:autoSpaceDE w:val="0"/>
               <w:autoSpaceDN w:val="0"/>
@@ -3943,7 +3943,7 @@
             <w:tcW w:w="0" w:type="auto"/>
             <w:hideMark/>
           </w:tcPr>
-          <w:p ns2:paraId="025AE109" ns2:textId="77777777">
+          <w:p>
             <w:pPr>
               <w:autoSpaceDE w:val="0"/>
               <w:autoSpaceDN w:val="0"/>
@@ -3965,13 +3965,13 @@
           </w:p>
         </w:tc>
       </w:tr>
-      <w:tr ns2:paraId="2E57244D" ns2:textId="77777777">
+      <w:tr>
         <w:tc>
           <w:tcPr>
             <w:tcW w:w="0" w:type="auto"/>
             <w:hideMark/>
           </w:tcPr>
-          <w:p ns2:paraId="55BA139A" ns2:textId="77777777">
+          <w:p>
             <w:pPr>
               <w:autoSpaceDE w:val="0"/>
               <w:autoSpaceDN w:val="0"/>
@@ -3997,7 +3997,7 @@
             <w:tcW w:w="0" w:type="auto"/>
             <w:hideMark/>
           </w:tcPr>
-          <w:p ns2:paraId="5E8EE9C3" ns2:textId="77777777">
+          <w:p>
             <w:pPr>
               <w:autoSpaceDE w:val="0"/>
               <w:autoSpaceDN w:val="0"/>
@@ -4023,7 +4023,7 @@
             <w:tcW w:w="0" w:type="auto"/>
             <w:hideMark/>
           </w:tcPr>
-          <w:p ns2:paraId="2BAAD07B" ns2:textId="77777777">
+          <w:p>
             <w:pPr>
               <w:autoSpaceDE w:val="0"/>
               <w:autoSpaceDN w:val="0"/>
@@ -4049,7 +4049,7 @@
             <w:tcW w:w="0" w:type="auto"/>
             <w:hideMark/>
           </w:tcPr>
-          <w:p ns2:paraId="530CD513" ns2:textId="77777777">
+          <w:p>
             <w:pPr>
               <w:autoSpaceDE w:val="0"/>
               <w:autoSpaceDN w:val="0"/>
@@ -4071,13 +4071,13 @@
           </w:p>
         </w:tc>
       </w:tr>
-      <w:tr ns2:paraId="5FE4863A" ns2:textId="77777777">
+      <w:tr>
         <w:tc>
           <w:tcPr>
             <w:tcW w:w="0" w:type="auto"/>
             <w:hideMark/>
           </w:tcPr>
-          <w:p ns2:paraId="6018751D" ns2:textId="77777777">
+          <w:p>
             <w:pPr>
               <w:autoSpaceDE w:val="0"/>
               <w:autoSpaceDN w:val="0"/>
@@ -4103,7 +4103,7 @@
             <w:tcW w:w="0" w:type="auto"/>
             <w:hideMark/>
           </w:tcPr>
-          <w:p ns2:paraId="2551BCE4" ns2:textId="77777777">
+          <w:p>
             <w:pPr>
               <w:autoSpaceDE w:val="0"/>
               <w:autoSpaceDN w:val="0"/>
@@ -4131,7 +4131,7 @@
             <w:tcW w:w="0" w:type="auto"/>
             <w:hideMark/>
           </w:tcPr>
-          <w:p ns2:paraId="4BC84B1F" ns2:textId="77777777">
+          <w:p>
             <w:pPr>
               <w:autoSpaceDE w:val="0"/>
               <w:autoSpaceDN w:val="0"/>
@@ -4157,7 +4157,7 @@
             <w:tcW w:w="0" w:type="auto"/>
             <w:hideMark/>
           </w:tcPr>
-          <w:p ns2:paraId="5DF6CB5D" ns2:textId="77777777">
+          <w:p>
             <w:pPr>
               <w:autoSpaceDE w:val="0"/>
               <w:autoSpaceDN w:val="0"/>
@@ -4179,13 +4179,13 @@
           </w:p>
         </w:tc>
       </w:tr>
-      <w:tr ns2:paraId="683B9432" ns2:textId="77777777">
+      <w:tr>
         <w:tc>
           <w:tcPr>
             <w:tcW w:w="0" w:type="auto"/>
             <w:hideMark/>
           </w:tcPr>
-          <w:p ns2:paraId="5CFE37EF" ns2:textId="77777777">
+          <w:p>
             <w:pPr>
               <w:autoSpaceDE w:val="0"/>
               <w:autoSpaceDN w:val="0"/>
@@ -4211,7 +4211,7 @@
             <w:tcW w:w="0" w:type="auto"/>
             <w:hideMark/>
           </w:tcPr>
-          <w:p ns2:paraId="1FB4B600" ns2:textId="77777777">
+          <w:p>
             <w:pPr>
               <w:autoSpaceDE w:val="0"/>
               <w:autoSpaceDN w:val="0"/>
@@ -4237,7 +4237,7 @@
             <w:tcW w:w="0" w:type="auto"/>
             <w:hideMark/>
           </w:tcPr>
-          <w:p ns2:paraId="72B6E03C" ns2:textId="77777777">
+          <w:p>
             <w:pPr>
               <w:autoSpaceDE w:val="0"/>
               <w:autoSpaceDN w:val="0"/>
@@ -4263,7 +4263,7 @@
             <w:tcW w:w="0" w:type="auto"/>
             <w:hideMark/>
           </w:tcPr>
-          <w:p ns2:paraId="6CC54D83" ns2:textId="77777777">
+          <w:p>
             <w:pPr>
               <w:autoSpaceDE w:val="0"/>
               <w:autoSpaceDN w:val="0"/>
@@ -4285,13 +4285,13 @@
           </w:p>
         </w:tc>
       </w:tr>
-      <w:tr ns2:paraId="06AB2E8B" ns2:textId="77777777">
+      <w:tr>
         <w:tc>
           <w:tcPr>
             <w:tcW w:w="0" w:type="auto"/>
             <w:hideMark/>
           </w:tcPr>
-          <w:p ns2:paraId="50B13ADF" ns2:textId="77777777">
+          <w:p>
             <w:pPr>
               <w:autoSpaceDE w:val="0"/>
               <w:autoSpaceDN w:val="0"/>
@@ -4317,7 +4317,7 @@
             <w:tcW w:w="0" w:type="auto"/>
             <w:hideMark/>
           </w:tcPr>
-          <w:p ns2:paraId="3A2C6EC1" ns2:textId="77777777">
+          <w:p>
             <w:pPr>
               <w:autoSpaceDE w:val="0"/>
               <w:autoSpaceDN w:val="0"/>
@@ -4343,7 +4343,7 @@
             <w:tcW w:w="0" w:type="auto"/>
             <w:hideMark/>
           </w:tcPr>
-          <w:p ns2:paraId="55A1B19C" ns2:textId="77777777">
+          <w:p>
             <w:pPr>
               <w:autoSpaceDE w:val="0"/>
               <w:autoSpaceDN w:val="0"/>
@@ -4369,7 +4369,7 @@
             <w:tcW w:w="0" w:type="auto"/>
             <w:hideMark/>
           </w:tcPr>
-          <w:p ns2:paraId="3727A329" ns2:textId="77777777">
+          <w:p>
             <w:pPr>
               <w:autoSpaceDE w:val="0"/>
               <w:autoSpaceDN w:val="0"/>
@@ -4391,13 +4391,13 @@
           </w:p>
         </w:tc>
       </w:tr>
-      <w:tr ns2:paraId="4F0816EC" ns2:textId="77777777">
+      <w:tr>
         <w:tc>
           <w:tcPr>
             <w:tcW w:w="0" w:type="auto"/>
             <w:hideMark/>
           </w:tcPr>
-          <w:p ns2:paraId="70254B62" ns2:textId="77777777">
+          <w:p>
             <w:pPr>
               <w:autoSpaceDE w:val="0"/>
               <w:autoSpaceDN w:val="0"/>
@@ -4423,7 +4423,7 @@
             <w:tcW w:w="0" w:type="auto"/>
             <w:hideMark/>
           </w:tcPr>
-          <w:p ns2:paraId="61C9D3FA" ns2:textId="77777777">
+          <w:p>
             <w:pPr>
               <w:autoSpaceDE w:val="0"/>
               <w:autoSpaceDN w:val="0"/>
@@ -4458,7 +4458,7 @@
             <w:tcW w:w="0" w:type="auto"/>
             <w:hideMark/>
           </w:tcPr>
-          <w:p ns2:paraId="16D614E2" ns2:textId="77777777">
+          <w:p>
             <w:pPr>
               <w:autoSpaceDE w:val="0"/>
               <w:autoSpaceDN w:val="0"/>
@@ -4484,7 +4484,7 @@
             <w:tcW w:w="0" w:type="auto"/>
             <w:hideMark/>
           </w:tcPr>
-          <w:p ns2:paraId="2DEBEDA1" ns2:textId="77777777">
+          <w:p>
             <w:pPr>
               <w:autoSpaceDE w:val="0"/>
               <w:autoSpaceDN w:val="0"/>
@@ -4506,13 +4506,13 @@
           </w:p>
         </w:tc>
       </w:tr>
-      <w:tr ns2:paraId="004C1549" ns2:textId="77777777">
+      <w:tr>
         <w:tc>
           <w:tcPr>
             <w:tcW w:w="0" w:type="auto"/>
             <w:hideMark/>
           </w:tcPr>
-          <w:p ns2:paraId="046448FC" ns2:textId="77777777">
+          <w:p>
             <w:pPr>
               <w:autoSpaceDE w:val="0"/>
               <w:autoSpaceDN w:val="0"/>
@@ -4538,7 +4538,7 @@
             <w:tcW w:w="0" w:type="auto"/>
             <w:hideMark/>
           </w:tcPr>
-          <w:p ns2:paraId="16509895" ns2:textId="77777777">
+          <w:p>
             <w:pPr>
               <w:autoSpaceDE w:val="0"/>
               <w:autoSpaceDN w:val="0"/>
@@ -4564,7 +4564,7 @@
             <w:tcW w:w="0" w:type="auto"/>
             <w:hideMark/>
           </w:tcPr>
-          <w:p ns2:paraId="2CFA45FA" ns2:textId="77777777">
+          <w:p>
             <w:pPr>
               <w:autoSpaceDE w:val="0"/>
               <w:autoSpaceDN w:val="0"/>
@@ -4590,7 +4590,7 @@
             <w:tcW w:w="0" w:type="auto"/>
             <w:hideMark/>
           </w:tcPr>
-          <w:p ns2:paraId="185B43FE" ns2:textId="77777777">
+          <w:p>
             <w:pPr>
               <w:autoSpaceDE w:val="0"/>
               <w:autoSpaceDN w:val="0"/>
@@ -4612,13 +4612,13 @@
           </w:p>
         </w:tc>
       </w:tr>
-      <w:tr ns2:paraId="74612601" ns2:textId="77777777">
+      <w:tr>
         <w:tc>
           <w:tcPr>
             <w:tcW w:w="0" w:type="auto"/>
             <w:hideMark/>
           </w:tcPr>
-          <w:p ns2:paraId="01D932DE" ns2:textId="77777777">
+          <w:p>
             <w:pPr>
               <w:autoSpaceDE w:val="0"/>
               <w:autoSpaceDN w:val="0"/>
@@ -4644,7 +4644,7 @@
             <w:tcW w:w="0" w:type="auto"/>
             <w:hideMark/>
           </w:tcPr>
-          <w:p ns2:paraId="04811B9C" ns2:textId="77777777">
+          <w:p>
             <w:pPr>
               <w:autoSpaceDE w:val="0"/>
               <w:autoSpaceDN w:val="0"/>
@@ -4670,7 +4670,7 @@
             <w:tcW w:w="0" w:type="auto"/>
             <w:hideMark/>
           </w:tcPr>
-          <w:p ns2:paraId="680CF0EC" ns2:textId="77777777">
+          <w:p>
             <w:pPr>
               <w:autoSpaceDE w:val="0"/>
               <w:autoSpaceDN w:val="0"/>
@@ -4696,7 +4696,7 @@
             <w:tcW w:w="0" w:type="auto"/>
             <w:hideMark/>
           </w:tcPr>
-          <w:p ns2:paraId="53836FB4" ns2:textId="77777777">
+          <w:p>
             <w:pPr>
               <w:autoSpaceDE w:val="0"/>
               <w:autoSpaceDN w:val="0"/>
@@ -4718,13 +4718,13 @@
           </w:p>
         </w:tc>
       </w:tr>
-      <w:tr ns2:paraId="1493351D" ns2:textId="77777777">
+      <w:tr>
         <w:tc>
           <w:tcPr>
             <w:tcW w:w="0" w:type="auto"/>
             <w:hideMark/>
           </w:tcPr>
-          <w:p ns2:paraId="4DFBD77E" ns2:textId="77777777">
+          <w:p>
             <w:pPr>
               <w:autoSpaceDE w:val="0"/>
               <w:autoSpaceDN w:val="0"/>
@@ -4750,7 +4750,7 @@
             <w:tcW w:w="0" w:type="auto"/>
             <w:hideMark/>
           </w:tcPr>
-          <w:p ns2:paraId="5186E29A" ns2:textId="77777777">
+          <w:p>
             <w:pPr>
               <w:autoSpaceDE w:val="0"/>
               <w:autoSpaceDN w:val="0"/>
@@ -4776,7 +4776,7 @@
             <w:tcW w:w="0" w:type="auto"/>
             <w:hideMark/>
           </w:tcPr>
-          <w:p ns2:paraId="3EB00204" ns2:textId="77777777">
+          <w:p>
             <w:pPr>
               <w:autoSpaceDE w:val="0"/>
               <w:autoSpaceDN w:val="0"/>
@@ -4802,7 +4802,7 @@
             <w:tcW w:w="0" w:type="auto"/>
             <w:hideMark/>
           </w:tcPr>
-          <w:p ns2:paraId="014A25A7" ns2:textId="77777777">
+          <w:p>
             <w:pPr>
               <w:autoSpaceDE w:val="0"/>
               <w:autoSpaceDN w:val="0"/>
@@ -4824,13 +4824,13 @@
           </w:p>
         </w:tc>
       </w:tr>
-      <w:tr ns2:paraId="43F620E3" ns2:textId="77777777">
+      <w:tr>
         <w:tc>
           <w:tcPr>
             <w:tcW w:w="0" w:type="auto"/>
             <w:hideMark/>
           </w:tcPr>
-          <w:p ns2:paraId="6E694AE9" ns2:textId="77777777">
+          <w:p>
             <w:pPr>
               <w:autoSpaceDE w:val="0"/>
               <w:autoSpaceDN w:val="0"/>
@@ -4856,7 +4856,7 @@
             <w:tcW w:w="0" w:type="auto"/>
             <w:hideMark/>
           </w:tcPr>
-          <w:p ns2:paraId="586BCCE2" ns2:textId="77777777">
+          <w:p>
             <w:pPr>
               <w:autoSpaceDE w:val="0"/>
               <w:autoSpaceDN w:val="0"/>
@@ -4882,7 +4882,7 @@
             <w:tcW w:w="0" w:type="auto"/>
             <w:hideMark/>
           </w:tcPr>
-          <w:p ns2:paraId="3A9FE27A" ns2:textId="77777777">
+          <w:p>
             <w:pPr>
               <w:autoSpaceDE w:val="0"/>
               <w:autoSpaceDN w:val="0"/>
@@ -4908,7 +4908,7 @@
             <w:tcW w:w="0" w:type="auto"/>
             <w:hideMark/>
           </w:tcPr>
-          <w:p ns2:paraId="22C03D23" ns2:textId="77777777">
+          <w:p>
             <w:pPr>
               <w:autoSpaceDE w:val="0"/>
               <w:autoSpaceDN w:val="0"/>
@@ -4931,7 +4931,7 @@
         </w:tc>
       </w:tr>
     </w:tbl>
-    <w:p ns2:paraId="0F288BF8" ns2:textId="043C9964">
+    <w:p>
       <w:pPr>
         <w:spacing w:line="500" w:lineRule="exact"/>
         <w:ind w:firstLineChars="200" w:firstLine="482"/>
@@ -4982,7 +4982,7 @@
         <w:t/>
       </w:r>
     </w:p>
-    <w:p ns2:paraId="218E5F6B" ns2:textId="77777777">
+    <w:p>
       <w:pPr>
         <w:pStyle w:val="2"/>
         <w:spacing w:line="500" w:lineRule="exact"/>
@@ -5011,7 +5011,7 @@
         <w:t/>
       </w:r>
     </w:p>
-    <w:p ns2:paraId="1ED6EB70" ns2:textId="1254BD5B">
+    <w:p>
       <w:pPr>
         <w:pStyle w:val="2"/>
         <w:spacing w:line="500" w:lineRule="exact"/>
@@ -5045,13 +5045,13 @@
         <w:gridCol w:w="2740"/>
         <w:gridCol w:w="781"/>
       </w:tblGrid>
-      <w:tr ns2:paraId="79BF57CB" ns2:textId="77777777">
+      <w:tr>
         <w:tc>
           <w:tcPr>
             <w:tcW w:w="0" w:type="auto"/>
             <w:hideMark/>
           </w:tcPr>
-          <w:p ns2:paraId="70132705" ns2:textId="77777777">
+          <w:p>
             <w:pPr>
               <w:autoSpaceDE w:val="0"/>
               <w:autoSpaceDN w:val="0"/>
@@ -5077,7 +5077,7 @@
             <w:tcW w:w="0" w:type="auto"/>
             <w:hideMark/>
           </w:tcPr>
-          <w:p ns2:paraId="29CCE2C7" ns2:textId="77777777">
+          <w:p>
             <w:pPr>
               <w:autoSpaceDE w:val="0"/>
               <w:autoSpaceDN w:val="0"/>
@@ -5103,7 +5103,7 @@
             <w:tcW w:w="0" w:type="auto"/>
             <w:hideMark/>
           </w:tcPr>
-          <w:p ns2:paraId="3424BECA" ns2:textId="77777777">
+          <w:p>
             <w:pPr>
               <w:autoSpaceDE w:val="0"/>
               <w:autoSpaceDN w:val="0"/>
@@ -5129,7 +5129,7 @@
             <w:tcW w:w="0" w:type="auto"/>
             <w:hideMark/>
           </w:tcPr>
-          <w:p ns2:paraId="00B824B4" ns2:textId="77777777">
+          <w:p>
             <w:pPr>
               <w:autoSpaceDE w:val="0"/>
               <w:autoSpaceDN w:val="0"/>
@@ -5155,7 +5155,7 @@
             <w:tcW w:w="0" w:type="auto"/>
             <w:hideMark/>
           </w:tcPr>
-          <w:p ns2:paraId="3364AE49" ns2:textId="77777777">
+          <w:p>
             <w:pPr>
               <w:autoSpaceDE w:val="0"/>
               <w:autoSpaceDN w:val="0"/>
@@ -5181,7 +5181,7 @@
             <w:tcW w:w="0" w:type="auto"/>
             <w:hideMark/>
           </w:tcPr>
-          <w:p ns2:paraId="387EF665" ns2:textId="77777777">
+          <w:p>
             <w:pPr>
               <w:autoSpaceDE w:val="0"/>
               <w:autoSpaceDN w:val="0"/>
@@ -5212,7 +5212,7 @@
           </w:p>
         </w:tc>
       </w:tr>
-      <w:tr ns2:paraId="3960CAF2" ns2:textId="77777777">
+      <w:tr>
         <w:tc>
           <w:tcPr>
             <w:tcW w:w="0" w:type="auto"/>
@@ -5220,7 +5220,7 @@
             <w:vAlign w:val="center"/>
             <w:hideMark/>
           </w:tcPr>
-          <w:p ns2:paraId="3C97F9D6" ns2:textId="77777777">
+          <w:p>
             <w:pPr>
               <w:autoSpaceDE w:val="0"/>
               <w:autoSpaceDN w:val="0"/>
@@ -5246,7 +5246,7 @@
             <w:tcW w:w="0" w:type="auto"/>
             <w:hideMark/>
           </w:tcPr>
-          <w:p ns2:paraId="2D586095" ns2:textId="77777777">
+          <w:p>
             <w:pPr>
               <w:autoSpaceDE w:val="0"/>
               <w:autoSpaceDN w:val="0"/>
@@ -5272,7 +5272,7 @@
             <w:tcW w:w="0" w:type="auto"/>
             <w:hideMark/>
           </w:tcPr>
-          <w:p ns2:paraId="327E05CD" ns2:textId="77777777">
+          <w:p>
             <w:pPr>
               <w:autoSpaceDE w:val="0"/>
               <w:autoSpaceDN w:val="0"/>
@@ -5298,7 +5298,7 @@
             <w:tcW w:w="0" w:type="auto"/>
             <w:hideMark/>
           </w:tcPr>
-          <w:p ns2:paraId="27B162DD" ns2:textId="77777777">
+          <w:p>
             <w:pPr>
               <w:autoSpaceDE w:val="0"/>
               <w:autoSpaceDN w:val="0"/>
@@ -5324,7 +5324,7 @@
             <w:tcW w:w="0" w:type="auto"/>
             <w:hideMark/>
           </w:tcPr>
-          <w:p ns2:paraId="5B2A8682" ns2:textId="77777777">
+          <w:p>
             <w:pPr>
               <w:autoSpaceDE w:val="0"/>
               <w:autoSpaceDN w:val="0"/>
@@ -5350,7 +5350,7 @@
             <w:tcW w:w="0" w:type="auto"/>
             <w:hideMark/>
           </w:tcPr>
-          <w:p ns2:paraId="09771B59" ns2:textId="77777777">
+          <w:p>
             <w:pPr>
               <w:autoSpaceDE w:val="0"/>
               <w:autoSpaceDN w:val="0"/>
@@ -5372,7 +5372,7 @@
           </w:p>
         </w:tc>
       </w:tr>
-      <w:tr ns2:paraId="454230D1" ns2:textId="77777777">
+      <w:tr>
         <w:tc>
           <w:tcPr>
             <w:tcW w:w="0" w:type="auto"/>
@@ -5380,7 +5380,7 @@
             <w:vAlign w:val="center"/>
             <w:hideMark/>
           </w:tcPr>
-          <w:p ns2:paraId="515686CC" ns2:textId="77777777">
+          <w:p>
             <w:pPr>
               <w:autoSpaceDE w:val="0"/>
               <w:autoSpaceDN w:val="0"/>
@@ -5402,7 +5402,7 @@
             <w:tcW w:w="0" w:type="auto"/>
             <w:hideMark/>
           </w:tcPr>
-          <w:p ns2:paraId="7F7E14A0" ns2:textId="77777777">
+          <w:p>
             <w:pPr>
               <w:autoSpaceDE w:val="0"/>
               <w:autoSpaceDN w:val="0"/>
@@ -5428,7 +5428,7 @@
             <w:tcW w:w="0" w:type="auto"/>
             <w:hideMark/>
           </w:tcPr>
-          <w:p ns2:paraId="22EA3A22" ns2:textId="77777777">
+          <w:p>
             <w:pPr>
               <w:autoSpaceDE w:val="0"/>
               <w:autoSpaceDN w:val="0"/>
@@ -5454,7 +5454,7 @@
             <w:tcW w:w="0" w:type="auto"/>
             <w:hideMark/>
           </w:tcPr>
-          <w:p ns2:paraId="0EC4F582" ns2:textId="77777777">
+          <w:p>
             <w:pPr>
               <w:autoSpaceDE w:val="0"/>
               <w:autoSpaceDN w:val="0"/>
@@ -5480,7 +5480,7 @@
             <w:tcW w:w="0" w:type="auto"/>
             <w:hideMark/>
           </w:tcPr>
-          <w:p ns2:paraId="350B36D2" ns2:textId="77777777">
+          <w:p>
             <w:pPr>
               <w:autoSpaceDE w:val="0"/>
               <w:autoSpaceDN w:val="0"/>
@@ -5506,7 +5506,7 @@
             <w:tcW w:w="0" w:type="auto"/>
             <w:hideMark/>
           </w:tcPr>
-          <w:p ns2:paraId="0A42F1C8" ns2:textId="77777777">
+          <w:p>
             <w:pPr>
               <w:autoSpaceDE w:val="0"/>
               <w:autoSpaceDN w:val="0"/>
@@ -5528,7 +5528,7 @@
           </w:p>
         </w:tc>
       </w:tr>
-      <w:tr ns2:paraId="6F3460BA" ns2:textId="77777777">
+      <w:tr>
         <w:tc>
           <w:tcPr>
             <w:tcW w:w="0" w:type="auto"/>
@@ -5536,7 +5536,7 @@
             <w:vAlign w:val="center"/>
             <w:hideMark/>
           </w:tcPr>
-          <w:p ns2:paraId="17578D62" ns2:textId="77777777">
+          <w:p>
             <w:pPr>
               <w:autoSpaceDE w:val="0"/>
               <w:autoSpaceDN w:val="0"/>
@@ -5558,7 +5558,7 @@
             <w:tcW w:w="0" w:type="auto"/>
             <w:hideMark/>
           </w:tcPr>
-          <w:p ns2:paraId="14D798B5" ns2:textId="77777777">
+          <w:p>
             <w:pPr>
               <w:autoSpaceDE w:val="0"/>
               <w:autoSpaceDN w:val="0"/>
@@ -5584,7 +5584,7 @@
             <w:tcW w:w="0" w:type="auto"/>
             <w:hideMark/>
           </w:tcPr>
-          <w:p ns2:paraId="2E0A22C2" ns2:textId="77777777">
+          <w:p>
             <w:pPr>
               <w:autoSpaceDE w:val="0"/>
               <w:autoSpaceDN w:val="0"/>
@@ -5610,7 +5610,7 @@
             <w:tcW w:w="0" w:type="auto"/>
             <w:hideMark/>
           </w:tcPr>
-          <w:p ns2:paraId="55E43F7F" ns2:textId="77777777">
+          <w:p>
             <w:pPr>
               <w:autoSpaceDE w:val="0"/>
               <w:autoSpaceDN w:val="0"/>
@@ -5636,7 +5636,7 @@
             <w:tcW w:w="0" w:type="auto"/>
             <w:hideMark/>
           </w:tcPr>
-          <w:p ns2:paraId="3064CEDE" ns2:textId="77777777">
+          <w:p>
             <w:pPr>
               <w:autoSpaceDE w:val="0"/>
               <w:autoSpaceDN w:val="0"/>
@@ -5662,7 +5662,7 @@
             <w:tcW w:w="0" w:type="auto"/>
             <w:hideMark/>
           </w:tcPr>
-          <w:p ns2:paraId="2660EB6C" ns2:textId="77777777">
+          <w:p>
             <w:pPr>
               <w:autoSpaceDE w:val="0"/>
               <w:autoSpaceDN w:val="0"/>
@@ -5684,7 +5684,7 @@
           </w:p>
         </w:tc>
       </w:tr>
-      <w:tr ns2:paraId="7DDA617F" ns2:textId="77777777">
+      <w:tr>
         <w:tc>
           <w:tcPr>
             <w:tcW w:w="0" w:type="auto"/>
@@ -5692,7 +5692,7 @@
             <w:vAlign w:val="center"/>
             <w:hideMark/>
           </w:tcPr>
-          <w:p ns2:paraId="476FBF3F" ns2:textId="77777777">
+          <w:p>
             <w:pPr>
               <w:autoSpaceDE w:val="0"/>
               <w:autoSpaceDN w:val="0"/>
@@ -5714,7 +5714,7 @@
             <w:tcW w:w="0" w:type="auto"/>
             <w:hideMark/>
           </w:tcPr>
-          <w:p ns2:paraId="2508C182" ns2:textId="77777777">
+          <w:p>
             <w:pPr>
               <w:autoSpaceDE w:val="0"/>
               <w:autoSpaceDN w:val="0"/>
@@ -5740,7 +5740,7 @@
             <w:tcW w:w="0" w:type="auto"/>
             <w:hideMark/>
           </w:tcPr>
-          <w:p ns2:paraId="5BF46819" ns2:textId="77777777">
+          <w:p>
             <w:pPr>
               <w:autoSpaceDE w:val="0"/>
               <w:autoSpaceDN w:val="0"/>
@@ -5766,7 +5766,7 @@
             <w:tcW w:w="0" w:type="auto"/>
             <w:hideMark/>
           </w:tcPr>
-          <w:p ns2:paraId="4A4A790C" ns2:textId="77777777">
+          <w:p>
             <w:pPr>
               <w:autoSpaceDE w:val="0"/>
               <w:autoSpaceDN w:val="0"/>
@@ -5792,7 +5792,7 @@
             <w:tcW w:w="0" w:type="auto"/>
             <w:hideMark/>
           </w:tcPr>
-          <w:p ns2:paraId="2612A5C4" ns2:textId="77777777">
+          <w:p>
             <w:pPr>
               <w:autoSpaceDE w:val="0"/>
               <w:autoSpaceDN w:val="0"/>
@@ -5818,7 +5818,7 @@
             <w:tcW w:w="0" w:type="auto"/>
             <w:hideMark/>
           </w:tcPr>
-          <w:p ns2:paraId="346E12F7" ns2:textId="77777777">
+          <w:p>
             <w:pPr>
               <w:autoSpaceDE w:val="0"/>
               <w:autoSpaceDN w:val="0"/>
@@ -5840,7 +5840,7 @@
           </w:p>
         </w:tc>
       </w:tr>
-      <w:tr ns2:paraId="46470642" ns2:textId="77777777">
+      <w:tr>
         <w:tc>
           <w:tcPr>
             <w:tcW w:w="0" w:type="auto"/>
@@ -5848,7 +5848,7 @@
             <w:vAlign w:val="center"/>
             <w:hideMark/>
           </w:tcPr>
-          <w:p ns2:paraId="3DDB4830" ns2:textId="77777777">
+          <w:p>
             <w:pPr>
               <w:autoSpaceDE w:val="0"/>
               <w:autoSpaceDN w:val="0"/>
@@ -5870,7 +5870,7 @@
             <w:tcW w:w="0" w:type="auto"/>
             <w:hideMark/>
           </w:tcPr>
-          <w:p ns2:paraId="206D2771" ns2:textId="77777777">
+          <w:p>
             <w:pPr>
               <w:autoSpaceDE w:val="0"/>
               <w:autoSpaceDN w:val="0"/>
@@ -5896,7 +5896,7 @@
             <w:tcW w:w="0" w:type="auto"/>
             <w:hideMark/>
           </w:tcPr>
-          <w:p ns2:paraId="168ED0E7" ns2:textId="77777777">
+          <w:p>
             <w:pPr>
               <w:autoSpaceDE w:val="0"/>
               <w:autoSpaceDN w:val="0"/>
@@ -5922,7 +5922,7 @@
             <w:tcW w:w="0" w:type="auto"/>
             <w:hideMark/>
           </w:tcPr>
-          <w:p ns2:paraId="7FF0DFE4" ns2:textId="77777777">
+          <w:p>
             <w:pPr>
               <w:autoSpaceDE w:val="0"/>
               <w:autoSpaceDN w:val="0"/>
@@ -5948,7 +5948,7 @@
             <w:tcW w:w="0" w:type="auto"/>
             <w:hideMark/>
           </w:tcPr>
-          <w:p ns2:paraId="56CA33F3" ns2:textId="77777777">
+          <w:p>
             <w:pPr>
               <w:autoSpaceDE w:val="0"/>
               <w:autoSpaceDN w:val="0"/>
@@ -5974,7 +5974,7 @@
             <w:tcW w:w="0" w:type="auto"/>
             <w:hideMark/>
           </w:tcPr>
-          <w:p ns2:paraId="2637D083" ns2:textId="77777777">
+          <w:p>
             <w:pPr>
               <w:autoSpaceDE w:val="0"/>
               <w:autoSpaceDN w:val="0"/>
@@ -5996,7 +5996,7 @@
           </w:p>
         </w:tc>
       </w:tr>
-      <w:tr ns2:paraId="275DC3F1" ns2:textId="77777777">
+      <w:tr>
         <w:tc>
           <w:tcPr>
             <w:tcW w:w="0" w:type="auto"/>
@@ -6004,7 +6004,7 @@
             <w:vAlign w:val="center"/>
             <w:hideMark/>
           </w:tcPr>
-          <w:p ns2:paraId="2DC7F58F" ns2:textId="77777777">
+          <w:p>
             <w:pPr>
               <w:autoSpaceDE w:val="0"/>
               <w:autoSpaceDN w:val="0"/>
@@ -6030,7 +6030,7 @@
             <w:tcW w:w="0" w:type="auto"/>
             <w:hideMark/>
           </w:tcPr>
-          <w:p ns2:paraId="6B2431C8" ns2:textId="77777777">
+          <w:p>
             <w:pPr>
               <w:autoSpaceDE w:val="0"/>
               <w:autoSpaceDN w:val="0"/>
@@ -6056,7 +6056,7 @@
             <w:tcW w:w="0" w:type="auto"/>
             <w:hideMark/>
           </w:tcPr>
-          <w:p ns2:paraId="6696C6C1" ns2:textId="77777777">
+          <w:p>
             <w:pPr>
               <w:autoSpaceDE w:val="0"/>
               <w:autoSpaceDN w:val="0"/>
@@ -6082,7 +6082,7 @@
             <w:tcW w:w="0" w:type="auto"/>
             <w:hideMark/>
           </w:tcPr>
-          <w:p ns2:paraId="4153D91E" ns2:textId="77777777">
+          <w:p>
             <w:pPr>
               <w:autoSpaceDE w:val="0"/>
               <w:autoSpaceDN w:val="0"/>
@@ -6108,7 +6108,7 @@
             <w:tcW w:w="0" w:type="auto"/>
             <w:hideMark/>
           </w:tcPr>
-          <w:p ns2:paraId="48BD292B" ns2:textId="77777777">
+          <w:p>
             <w:pPr>
               <w:autoSpaceDE w:val="0"/>
               <w:autoSpaceDN w:val="0"/>
@@ -6134,7 +6134,7 @@
             <w:tcW w:w="0" w:type="auto"/>
             <w:hideMark/>
           </w:tcPr>
-          <w:p ns2:paraId="1BE12539" ns2:textId="77777777">
+          <w:p>
             <w:pPr>
               <w:autoSpaceDE w:val="0"/>
               <w:autoSpaceDN w:val="0"/>
@@ -6156,14 +6156,14 @@
           </w:p>
         </w:tc>
       </w:tr>
-      <w:tr ns2:paraId="5425291C" ns2:textId="77777777">
+      <w:tr>
         <w:tc>
           <w:tcPr>
             <w:tcW w:w="0" w:type="auto"/>
             <w:vMerge/>
             <w:hideMark/>
           </w:tcPr>
-          <w:p ns2:paraId="5332ABEC" ns2:textId="77777777">
+          <w:p>
             <w:pPr>
               <w:autoSpaceDE w:val="0"/>
               <w:autoSpaceDN w:val="0"/>
@@ -6185,7 +6185,7 @@
             <w:tcW w:w="0" w:type="auto"/>
             <w:hideMark/>
           </w:tcPr>
-          <w:p ns2:paraId="59FA5F7D" ns2:textId="77777777">
+          <w:p>
             <w:pPr>
               <w:autoSpaceDE w:val="0"/>
               <w:autoSpaceDN w:val="0"/>
@@ -6211,7 +6211,7 @@
             <w:tcW w:w="0" w:type="auto"/>
             <w:hideMark/>
           </w:tcPr>
-          <w:p ns2:paraId="752E27AE" ns2:textId="77777777">
+          <w:p>
             <w:pPr>
               <w:autoSpaceDE w:val="0"/>
               <w:autoSpaceDN w:val="0"/>
@@ -6237,7 +6237,7 @@
             <w:tcW w:w="0" w:type="auto"/>
             <w:hideMark/>
           </w:tcPr>
-          <w:p ns2:paraId="06B54649" ns2:textId="77777777">
+          <w:p>
             <w:pPr>
               <w:autoSpaceDE w:val="0"/>
               <w:autoSpaceDN w:val="0"/>
@@ -6263,7 +6263,7 @@
             <w:tcW w:w="0" w:type="auto"/>
             <w:hideMark/>
           </w:tcPr>
-          <w:p ns2:paraId="73560C99" ns2:textId="77777777">
+          <w:p>
             <w:pPr>
               <w:autoSpaceDE w:val="0"/>
               <w:autoSpaceDN w:val="0"/>
@@ -6289,7 +6289,7 @@
             <w:tcW w:w="0" w:type="auto"/>
             <w:hideMark/>
           </w:tcPr>
-          <w:p ns2:paraId="472E3E9F" ns2:textId="77777777">
+          <w:p>
             <w:pPr>
               <w:autoSpaceDE w:val="0"/>
               <w:autoSpaceDN w:val="0"/>
@@ -6312,7 +6312,7 @@
         </w:tc>
       </w:tr>
     </w:tbl>
-    <w:p ns2:paraId="69DD3DDD" ns2:textId="77777777">
+    <w:p>
       <w:pPr>
         <w:pStyle w:val="2"/>
         <w:spacing w:line="500" w:lineRule="exact"/>
@@ -6332,7 +6332,7 @@
         <w:t xml:space="preserve">评分细则:</w:t>
       </w:r>
     </w:p>
-    <w:p ns2:paraId="679B3E32" ns2:textId="7DE2AF18">
+    <w:p>
       <w:pPr>
         <w:spacing w:line="500" w:lineRule="exact"/>
         <w:ind w:firstLineChars="200" w:firstLine="480"/>
@@ -6376,7 +6376,7 @@
         <w:t/>
       </w:r>
     </w:p>
-    <w:p ns2:paraId="49ADE81E" ns2:textId="28B3DCF8">
+    <w:p>
       <w:pPr>
         <w:pStyle w:val="2"/>
         <w:spacing w:line="500" w:lineRule="exact"/>
@@ -6420,7 +6420,7 @@
         <w:t/>
       </w:r>
     </w:p>
-    <w:p ns2:paraId="2FAEAC94" ns2:textId="46DCAA43">
+    <w:p>
       <w:pPr>
         <w:pStyle w:val="2"/>
         <w:spacing w:line="500" w:lineRule="exact"/>
@@ -6464,7 +6464,7 @@
         <w:t/>
       </w:r>
     </w:p>
-    <w:p ns2:paraId="5B1F6FE6" ns2:textId="39F1D08A">
+    <w:p>
       <w:pPr>
         <w:pStyle w:val="2"/>
         <w:spacing w:line="500" w:lineRule="exact"/>
@@ -6508,7 +6508,7 @@
         <w:t/>
       </w:r>
     </w:p>
-    <w:p ns2:paraId="6014A4FE" ns2:textId="2654F771">
+    <w:p>
       <w:pPr>
         <w:pStyle w:val="2"/>
         <w:spacing w:line="500" w:lineRule="exact"/>
@@ -6552,7 +6552,7 @@
         <w:t/>
       </w:r>
     </w:p>
-    <w:p ns2:paraId="130A8755" ns2:textId="78830462">
+    <w:p>
       <w:pPr>
         <w:pStyle w:val="2"/>
         <w:spacing w:line="500" w:lineRule="exact"/>
@@ -6614,7 +6614,7 @@
         <w:t/>
       </w:r>
     </w:p>
-    <w:p ns2:paraId="15F6804E" ns2:textId="62B0827B">
+    <w:p>
       <w:pPr>
         <w:pStyle w:val="2"/>
         <w:spacing w:line="500" w:lineRule="exact"/>
@@ -6658,7 +6658,7 @@
         <w:t/>
       </w:r>
     </w:p>
-    <w:p ns2:paraId="2CA4DB32" ns2:textId="67B21E56">
+    <w:p>
       <w:pPr>
         <w:pStyle w:val="2"/>
         <w:spacing w:line="500" w:lineRule="exact"/>
@@ -6702,7 +6702,7 @@
         <w:t/>
       </w:r>
     </w:p>
-    <w:p ns2:paraId="4B79E31B" ns2:textId="16B2DD8C">
+    <w:p>
       <w:pPr>
         <w:pStyle w:val="2"/>
         <w:spacing w:line="500" w:lineRule="exact"/>
@@ -6746,7 +6746,7 @@
         <w:t/>
       </w:r>
     </w:p>
-    <w:p ns2:paraId="1E0A69C3" ns2:textId="3B93EF74">
+    <w:p>
       <w:pPr>
         <w:pStyle w:val="2"/>
         <w:spacing w:line="500" w:lineRule="exact"/>
@@ -6790,7 +6790,7 @@
         <w:t/>
       </w:r>
     </w:p>
-    <w:p ns2:paraId="10882759" ns2:textId="41AEE32D">
+    <w:p>
       <w:pPr>
         <w:pStyle w:val="2"/>
         <w:spacing w:line="500" w:lineRule="exact"/>
@@ -6834,7 +6834,7 @@
         <w:t/>
       </w:r>
     </w:p>
-    <w:p ns2:paraId="525A3C13" ns2:textId="6450B123">
+    <w:p>
       <w:pPr>
         <w:pStyle w:val="2"/>
         <w:spacing w:line="500" w:lineRule="exact"/>
@@ -6878,7 +6878,7 @@
         <w:t/>
       </w:r>
     </w:p>
-    <w:p ns2:paraId="6ABF8E53" ns2:textId="07D66D09">
+    <w:p>
       <w:pPr>
         <w:pStyle w:val="2"/>
         <w:spacing w:line="500" w:lineRule="exact"/>
@@ -6922,7 +6922,7 @@
         <w:t/>
       </w:r>
     </w:p>
-    <w:p ns2:paraId="51C3F5CB" ns2:textId="4C36F533">
+    <w:p>
       <w:pPr>
         <w:pStyle w:val="2"/>
         <w:spacing w:line="500" w:lineRule="exact"/>
@@ -6966,7 +6966,7 @@
         <w:t/>
       </w:r>
     </w:p>
-    <w:p ns2:paraId="65B95F4F" ns2:textId="77777777">
+    <w:p>
       <w:pPr>
         <w:pStyle w:val="2"/>
         <w:spacing w:line="500" w:lineRule="exact"/>
@@ -6987,7 +6987,7 @@
         <w:t xml:space="preserve">是否如实说明生成式AI及数字人素材的使用情况。</w:t>
       </w:r>
     </w:p>
-    <w:p ns2:paraId="138A4F7D" ns2:textId="77777777">
+    <w:p>
       <w:pPr>
         <w:pStyle w:val="2"/>
         <w:spacing w:line="500" w:lineRule="exact"/>
@@ -7007,7 +7007,7 @@
         <w:t xml:space="preserve">是否按要求标注合成内容并核验作品中的事实信息。</w:t>
       </w:r>
     </w:p>
-    <w:p ns2:paraId="3C183691" ns2:textId="77777777">
+    <w:p>
       <w:pPr>
         <w:pStyle w:val="2"/>
         <w:spacing w:line="500" w:lineRule="exact"/>
@@ -7027,7 +7027,7 @@
         <w:t xml:space="preserve">是否遵守版权、肖像声音权益和个人信息保护要求。</w:t>
       </w:r>
     </w:p>
-    <w:p ns2:paraId="07F22F72" ns2:textId="77777777">
+    <w:p>
       <w:pPr>
         <w:pStyle w:val="2"/>
         <w:spacing w:line="500" w:lineRule="exact"/>
@@ -7047,7 +7047,7 @@
         <w:t xml:space="preserve">是否存在抄袭、冒用身份或未经许可使用素材等行为。</w:t>
       </w:r>
     </w:p>
-    <w:p ns2:paraId="7D7EB4FE" ns2:textId="77777777">
+    <w:p>
       <w:pPr>
         <w:adjustRightInd w:val="0"/>
         <w:snapToGrid w:val="0"/>
@@ -7073,7 +7073,7 @@
         <w:t xml:space="preserve">六、其他说明</w:t>
       </w:r>
     </w:p>
-    <w:p ns2:paraId="00F27FDE" ns2:textId="30A15253">
+    <w:p>
       <w:pPr>
         <w:spacing w:line="500" w:lineRule="exact"/>
         <w:ind w:firstLineChars="200" w:firstLine="482"/>
@@ -7127,7 +7127,7 @@
         <w:t/>
       </w:r>
     </w:p>
-    <w:p ns2:paraId="72202A68" ns2:textId="25EDFCAD">
+    <w:p>
       <w:pPr>
         <w:pStyle w:val="2"/>
         <w:spacing w:line="500" w:lineRule="exact"/>
@@ -7179,7 +7179,7 @@
         <w:t/>
       </w:r>
     </w:p>
-    <w:p ns2:paraId="5707D1EA" ns2:textId="77777777">
+    <w:p>
       <w:pPr>
         <w:pStyle w:val="2"/>
         <w:spacing w:line="500" w:lineRule="exact"/>
@@ -7199,7 +7199,7 @@
         <w:t xml:space="preserve">技术跟踪机制：关注数字人和视频工具更新，评估后再纳入课堂，保留工具替代方案。</w:t>
       </w:r>
     </w:p>
-    <w:p ns2:paraId="620CE63B" ns2:textId="77777777">
+    <w:p>
       <w:pPr>
         <w:pStyle w:val="2"/>
         <w:spacing w:line="500" w:lineRule="exact"/>
@@ -7219,7 +7219,7 @@
         <w:t xml:space="preserve">案例反馈机制：根据校园传播需求和行业案例变化更新任务素材，严格落实授权与脱敏。</w:t>
       </w:r>
     </w:p>
-    <w:p ns2:paraId="23E958AD" ns2:textId="77777777">
+    <w:p>
       <w:pPr>
         <w:pStyle w:val="2"/>
         <w:spacing w:line="500" w:lineRule="exact"/>
@@ -7239,7 +7239,7 @@
         <w:t xml:space="preserve">教学研讨机制：定期交流项目教学、作品评价和合规审查经验。</w:t>
       </w:r>
     </w:p>
-    <w:p ns2:paraId="49FBA643" ns2:textId="77777777">
+    <w:p>
       <w:pPr>
         <w:pStyle w:val="2"/>
         <w:spacing w:line="500" w:lineRule="exact"/>
@@ -7259,7 +7259,7 @@
         <w:t xml:space="preserve">资源迭代机制：在授权与审核前提下建设可复用的案例和学生作品资源。</w:t>
       </w:r>
     </w:p>
-    <w:p ns2:paraId="562621C5" ns2:textId="3848BE75">
+    <w:p>
       <w:pPr>
         <w:spacing w:line="500" w:lineRule="exact"/>
         <w:ind w:firstLineChars="200" w:firstLine="482"/>
@@ -7313,7 +7313,7 @@
         <w:t/>
       </w:r>
     </w:p>
-    <w:p ns2:paraId="0FEA5CB5" ns2:textId="77777777">
+    <w:p>
       <w:pPr>
         <w:pStyle w:val="2"/>
         <w:spacing w:line="500" w:lineRule="exact"/>
@@ -7351,7 +7351,7 @@
         <w:t/>
       </w:r>
     </w:p>
-    <w:p ns2:paraId="2CF352F0" ns2:textId="77777777">
+    <w:p>
       <w:pPr>
         <w:pStyle w:val="2"/>
         <w:spacing w:line="500" w:lineRule="exact"/>
@@ -7371,7 +7371,7 @@
         <w:t xml:space="preserve">课堂积极参与脚本、分镜和制作实操，遇到问题及时沟通。</w:t>
       </w:r>
     </w:p>
-    <w:p ns2:paraId="0DC18A19" ns2:textId="77777777">
+    <w:p>
       <w:pPr>
         <w:pStyle w:val="2"/>
         <w:spacing w:line="500" w:lineRule="exact"/>
@@ -7391,7 +7391,7 @@
         <w:t xml:space="preserve">课后整理工程文件、素材来源和修改记录，按要求完成作品迭代。</w:t>
       </w:r>
     </w:p>
-    <w:p ns2:paraId="54DB8A71" ns2:textId="77777777">
+    <w:p>
       <w:pPr>
         <w:pStyle w:val="2"/>
         <w:spacing w:line="500" w:lineRule="exact"/>
@@ -7411,7 +7411,7 @@
         <w:t xml:space="preserve">持续关注数字内容制作技术、平台规则和合成内容规范。</w:t>
       </w:r>
     </w:p>
-    <w:p ns2:paraId="055AF515" ns2:textId="77777777">
+    <w:p>
       <w:pPr>
         <w:pStyle w:val="2"/>
         <w:spacing w:line="500" w:lineRule="exact"/>
@@ -7431,7 +7431,7 @@
         <w:t xml:space="preserve">坚持诚信创作，不冒用身份，不传播未经核验或未经授权的内容。</w:t>
       </w:r>
     </w:p>
-    <w:p ns2:paraId="0D78ECEA" ns2:textId="1B587494">
+    <w:p>
       <w:pPr>
         <w:spacing w:line="500" w:lineRule="exact"/>
         <w:ind w:firstLineChars="200" w:firstLine="482"/>
@@ -7485,7 +7485,7 @@
         <w:t/>
       </w:r>
     </w:p>
-    <w:p ns2:paraId="73258F04" ns2:textId="77777777">
+    <w:p>
       <w:pPr>
         <w:pStyle w:val="2"/>
         <w:spacing w:line="500" w:lineRule="exact"/>
@@ -7505,7 +7505,7 @@
         <w:t xml:space="preserve">工具选择：根据学校网络、账号和费用条件选择合规可用工具，避免将平台绑定为课程唯一条件。</w:t>
       </w:r>
     </w:p>
-    <w:p ns2:paraId="02EC8DA2" ns2:textId="77777777">
+    <w:p>
       <w:pPr>
         <w:pStyle w:val="2"/>
         <w:spacing w:line="500" w:lineRule="exact"/>
@@ -7525,7 +7525,7 @@
         <w:t xml:space="preserve">场景真实：课程任务围绕真实传播需求设计，学生作品发布前须经授权和必要审核。</w:t>
       </w:r>
     </w:p>
-    <w:p ns2:paraId="48023906" ns2:textId="77777777">
+    <w:p>
       <w:pPr>
         <w:pStyle w:val="2"/>
         <w:spacing w:line="500" w:lineRule="exact"/>
@@ -7545,7 +7545,7 @@
         <w:t xml:space="preserve">成果应用：合格作品可在取得相关授权并通过审核后用于校园展示或个人作品集。</w:t>
       </w:r>
     </w:p>
-    <w:p ns2:paraId="1852655D" ns2:textId="77777777">
+    <w:p>
       <w:pPr>
         <w:pStyle w:val="2"/>
         <w:spacing w:line="500" w:lineRule="exact"/>
@@ -7566,7 +7566,7 @@
         <w:t xml:space="preserve">动态更新：结合工具能力、版权政策及学生反馈持续更新案例和实训要求。</w:t>
       </w:r>
     </w:p>
-    <w:p ns2:paraId="2C076486" ns2:textId="77777777">
+    <w:p>
       <w:pPr>
         <w:pStyle w:val="2"/>
         <w:spacing w:line="500" w:lineRule="exact"/>
@@ -7586,7 +7586,7 @@
         <w:t xml:space="preserve">开放包容：鼓励学生探索不同工具和表达方式，并对技术结果进行审慎判断。</w:t>
       </w:r>
     </w:p>
-    <w:p ns2:paraId="32A823F3" ns2:textId="79FF01FF">
+    <w:p>
       <w:pPr>
         <w:pStyle w:val="2"/>
         <w:spacing w:line="500" w:lineRule="exact"/>
@@ -7630,7 +7630,7 @@
         <w:t/>
       </w:r>
     </w:p>
-    <w:p ns2:paraId="7777EEC0" ns2:textId="77777777">
+    <w:p>
       <w:pPr>
         <w:pStyle w:val="2"/>
         <w:spacing w:line="500" w:lineRule="exact"/>
@@ -7650,7 +7650,7 @@
         <w:t xml:space="preserve">技术支持：提供工具基本操作、作品制作和常见问题答疑。</w:t>
       </w:r>
     </w:p>
-    <w:p ns2:paraId="4F0F34E9" ns2:textId="77777777">
+    <w:p>
       <w:pPr>
         <w:pStyle w:val="2"/>
         <w:spacing w:line="500" w:lineRule="exact"/>
@@ -7670,7 +7670,7 @@
         <w:t xml:space="preserve">资源支持：提供任务模板、合规清单、案例与评价标准。</w:t>
       </w:r>
     </w:p>
-    <w:p ns2:paraId="156D9D8C" ns2:textId="77777777">
+    <w:p>
       <w:pPr>
         <w:pStyle w:val="2"/>
         <w:spacing w:line="500" w:lineRule="exact"/>
@@ -7690,7 +7690,7 @@
         <w:t xml:space="preserve">平台支持：依托校内教学平台开展资源共享、作业提交与互动。</w:t>
       </w:r>
     </w:p>
-    <w:p ns2:paraId="2941C19A" ns2:textId="77777777">
+    <w:p>
       <w:pPr>
         <w:pStyle w:val="2"/>
         <w:spacing w:line="500" w:lineRule="exact"/>
@@ -7710,7 +7710,7 @@
         <w:t xml:space="preserve">竞赛支持：择优推荐符合赛事规则和授权要求的作品参加相关活动。</w:t>
       </w:r>
     </w:p>
-    <w:p ns2:paraId="39A0A86B" ns2:textId="3122059E">
+    <w:p>
       <w:pPr>
         <w:pStyle w:val="2"/>
         <w:spacing w:line="500" w:lineRule="exact"/>
@@ -7730,7 +7730,7 @@
         <w:t xml:space="preserve">课程建设团队:</w:t>
       </w:r>
     </w:p>
-    <w:p ns2:paraId="6369EC0F" ns2:textId="6CFEB89D">
+    <w:p>
       <w:pPr>
         <w:pStyle w:val="2"/>
         <w:spacing w:line="500" w:lineRule="exact"/>
@@ -7759,7 +7759,7 @@
         <w:t/>
       </w:r>
     </w:p>
-    <w:p ns2:paraId="7191D775" ns2:textId="510EACCA">
+    <w:p>
       <w:pPr>
         <w:pStyle w:val="2"/>
         <w:spacing w:line="500" w:lineRule="exact"/>
@@ -7780,7 +7780,7 @@
         <w:t xml:space="preserve">审核人:</w:t>
       </w:r>
     </w:p>
-    <w:p ns2:paraId="0303A5CF" ns2:textId="726D3F5E">
+    <w:p>
       <w:pPr>
         <w:pStyle w:val="2"/>
         <w:spacing w:line="500" w:lineRule="exact"/>
@@ -7809,7 +7809,7 @@
         <w:t/>
       </w:r>
     </w:p>
-    <w:p ns2:paraId="76B5E383" ns2:textId="77777777">
+    <w:p>
       <w:pPr>
         <w:pStyle w:val="2"/>
         <w:spacing w:line="500" w:lineRule="exact"/>
@@ -7821,7 +7821,7 @@
         </w:rPr>
       </w:pPr>
     </w:p>
-    <w:p ns2:paraId="273B221D" ns2:textId="77777777">
+    <w:p>
       <w:pPr>
         <w:pStyle w:val="2"/>
         <w:spacing w:line="500" w:lineRule="exact"/>
@@ -7833,7 +7833,7 @@
         </w:rPr>
       </w:pPr>
     </w:p>
-    <w:p ns2:paraId="16734CA3" ns2:textId="77777777">
+    <w:p>
       <w:pPr>
         <w:pStyle w:val="2"/>
         <w:spacing w:line="500" w:lineRule="exact"/>
@@ -7845,7 +7845,7 @@
         </w:rPr>
       </w:pPr>
     </w:p>
-    <w:p ns2:paraId="717BFC23" ns2:textId="77777777">
+    <w:p>
       <w:pPr>
         <w:pStyle w:val="2"/>
         <w:spacing w:line="500" w:lineRule="exact"/>
@@ -7857,7 +7857,7 @@
         </w:rPr>
       </w:pPr>
     </w:p>
-    <w:p ns2:paraId="4CD9B195" ns2:textId="77777777">
+    <w:p>
       <w:pPr>
         <w:pStyle w:val="2"/>
         <w:spacing w:line="500" w:lineRule="exact"/>
@@ -7869,7 +7869,7 @@
         </w:rPr>
       </w:pPr>
     </w:p>
-    <w:p ns2:paraId="505C89F1" ns2:textId="77777777">
+    <w:p>
       <w:pPr>
         <w:pStyle w:val="2"/>
         <w:spacing w:line="500" w:lineRule="exact"/>
@@ -7881,7 +7881,7 @@
         </w:rPr>
       </w:pPr>
     </w:p>
-    <w:p ns2:paraId="62B22A9C" ns2:textId="77777777">
+    <w:p>
       <w:pPr>
         <w:pStyle w:val="2"/>
         <w:spacing w:line="500" w:lineRule="exact"/>
@@ -7893,7 +7893,7 @@
         </w:rPr>
       </w:pPr>
     </w:p>
-    <w:p ns2:paraId="35F851AF" ns2:textId="77777777">
+    <w:p>
       <w:pPr>
         <w:pStyle w:val="2"/>
         <w:spacing w:line="500" w:lineRule="exact"/>
@@ -7905,7 +7905,7 @@
         </w:rPr>
       </w:pPr>
     </w:p>
-    <w:p ns2:paraId="6638E772" ns2:textId="77777777">
+    <w:p>
       <w:pPr>
         <w:pStyle w:val="2"/>
         <w:spacing w:line="500" w:lineRule="exact"/>
@@ -7917,7 +7917,7 @@
         </w:rPr>
       </w:pPr>
     </w:p>
-    <w:p ns2:paraId="0A5FDF76" ns2:textId="77777777">
+    <w:p>
       <w:pPr>
         <w:pStyle w:val="2"/>
         <w:spacing w:line="500" w:lineRule="exact"/>
@@ -7929,7 +7929,7 @@
         </w:rPr>
       </w:pPr>
     </w:p>
-    <w:p ns2:paraId="4761BE14" ns2:textId="77777777">
+    <w:p>
       <w:pPr>
         <w:pStyle w:val="2"/>
         <w:spacing w:line="500" w:lineRule="exact"/>
@@ -7941,7 +7941,7 @@
         </w:rPr>
       </w:pPr>
     </w:p>
-    <w:p ns2:paraId="4085C68F" ns2:textId="77777777">
+    <w:p>
       <w:pPr>
         <w:pStyle w:val="2"/>
         <w:spacing w:line="500" w:lineRule="exact"/>
@@ -7953,7 +7953,7 @@
         </w:rPr>
       </w:pPr>
     </w:p>
-    <w:p ns2:paraId="3395F599" ns2:textId="77777777">
+    <w:p>
       <w:pPr>
         <w:pStyle w:val="2"/>
         <w:spacing w:line="500" w:lineRule="exact"/>
@@ -7965,7 +7965,7 @@
         </w:rPr>
       </w:pPr>
     </w:p>
-    <w:p ns2:paraId="47F70C66" ns2:textId="77777777">
+    <w:p>
       <w:pPr>
         <w:pStyle w:val="2"/>
         <w:spacing w:line="500" w:lineRule="exact"/>
@@ -7977,7 +7977,7 @@
         </w:rPr>
       </w:pPr>
     </w:p>
-    <w:p ns2:paraId="79A4103B" ns2:textId="77777777">
+    <w:p>
       <w:pPr>
         <w:pStyle w:val="2"/>
         <w:spacing w:line="500" w:lineRule="exact"/>
@@ -7989,7 +7989,7 @@
         </w:rPr>
       </w:pPr>
     </w:p>
-    <w:p ns2:paraId="4245A276" ns2:textId="77777777">
+    <w:p>
       <w:pPr>
         <w:pStyle w:val="2"/>
         <w:spacing w:line="500" w:lineRule="exact"/>
@@ -8001,7 +8001,7 @@
         </w:rPr>
       </w:pPr>
     </w:p>
-    <w:p ns2:paraId="0A7C69E4" ns2:textId="77777777">
+    <w:p>
       <w:pPr>
         <w:widowControl/>
         <w:jc w:val="left"/>
@@ -8026,7 +8026,7 @@
         <w:br w:type="page"/>
       </w:r>
     </w:p>
-    <w:p ns2:paraId="204E2BCD" ns2:textId="3AE61186">
+    <w:p>
       <w:pPr>
         <w:adjustRightInd w:val="0"/>
         <w:snapToGrid w:val="0"/>
@@ -8070,13 +8070,13 @@
         <w:gridCol w:w="3977"/>
         <w:gridCol w:w="698"/>
       </w:tblGrid>
-      <w:tr ns2:paraId="6BB30CF6" ns2:textId="77777777">
+      <w:tr>
         <w:tc>
           <w:tcPr>
             <w:tcW w:w="0" w:type="auto"/>
             <w:hideMark/>
           </w:tcPr>
-          <w:p ns2:paraId="28567261" ns2:textId="77777777">
+          <w:p>
             <w:pPr>
               <w:spacing w:line="520" w:lineRule="exact"/>
               <w:jc w:val="center"/>
@@ -8103,7 +8103,7 @@
             <w:tcW w:w="1780" w:type="dxa"/>
             <w:hideMark/>
           </w:tcPr>
-          <w:p ns2:paraId="176EB64D" ns2:textId="77777777">
+          <w:p>
             <w:pPr>
               <w:spacing w:line="520" w:lineRule="exact"/>
               <w:jc w:val="center"/>
@@ -8130,7 +8130,7 @@
             <w:tcW w:w="2834" w:type="dxa"/>
             <w:hideMark/>
           </w:tcPr>
-          <w:p ns2:paraId="0D547142" ns2:textId="77777777">
+          <w:p>
             <w:pPr>
               <w:spacing w:line="520" w:lineRule="exact"/>
               <w:jc w:val="center"/>
@@ -8157,7 +8157,7 @@
             <w:tcW w:w="4111" w:type="dxa"/>
             <w:hideMark/>
           </w:tcPr>
-          <w:p ns2:paraId="7B8996D0" ns2:textId="77777777">
+          <w:p>
             <w:pPr>
               <w:spacing w:line="520" w:lineRule="exact"/>
               <w:jc w:val="center"/>
@@ -8184,7 +8184,7 @@
             <w:tcW w:w="3977" w:type="dxa"/>
             <w:hideMark/>
           </w:tcPr>
-          <w:p ns2:paraId="686B9F59" ns2:textId="77777777">
+          <w:p>
             <w:pPr>
               <w:spacing w:line="520" w:lineRule="exact"/>
               <w:jc w:val="center"/>
@@ -8211,7 +8211,7 @@
             <w:tcW w:w="0" w:type="auto"/>
             <w:hideMark/>
           </w:tcPr>
-          <w:p ns2:paraId="03CD07DB" ns2:textId="77777777">
+          <w:p>
             <w:pPr>
               <w:spacing w:line="520" w:lineRule="exact"/>
               <w:jc w:val="center"/>
@@ -8234,14 +8234,14 @@
           </w:p>
         </w:tc>
       </w:tr>
-      <w:tr ns2:paraId="183D4019" ns2:textId="77777777">
+      <w:tr>
         <w:tc>
           <w:tcPr>
             <w:tcW w:w="0" w:type="auto"/>
             <w:vAlign w:val="center"/>
             <w:hideMark/>
           </w:tcPr>
-          <w:p ns2:paraId="4F05203E" ns2:textId="77777777">
+          <w:p>
             <w:pPr>
               <w:jc w:val="left"/>
               <w:rPr>
@@ -8263,7 +8263,7 @@
             <w:tcW w:w="1780" w:type="dxa"/>
             <w:hideMark/>
           </w:tcPr>
-          <w:p ns2:paraId="12B2D380" ns2:textId="77777777">
+          <w:p>
             <w:pPr>
               <w:rPr>
                 <w:rFonts w:ascii="宋体" w:hAnsi="宋体"/>
@@ -8284,7 +8284,7 @@
             <w:tcW w:w="2834" w:type="dxa"/>
             <w:hideMark/>
           </w:tcPr>
-          <w:p ns2:paraId="25300B48" ns2:textId="77777777">
+          <w:p>
             <w:pPr>
               <w:pStyle w:val="2"/>
               <w:spacing w:line="240" w:lineRule="auto"/>
@@ -8302,7 +8302,7 @@
               <w:t xml:space="preserve">数字人短视频课程目标</w:t>
             </w:r>
           </w:p>
-          <w:p ns2:paraId="54180AB7" ns2:textId="77777777">
+          <w:p>
             <w:pPr>
               <w:pStyle w:val="2"/>
               <w:spacing w:line="240" w:lineRule="auto"/>
@@ -8320,7 +8320,7 @@
               <w:t xml:space="preserve">生成式AI基础</w:t>
             </w:r>
           </w:p>
-          <w:p ns2:paraId="2F354567" ns2:textId="77777777">
+          <w:p>
             <w:pPr>
               <w:pStyle w:val="2"/>
               <w:spacing w:line="240" w:lineRule="auto"/>
@@ -8338,7 +8338,7 @@
               <w:t xml:space="preserve">应用场景</w:t>
             </w:r>
           </w:p>
-          <w:p ns2:paraId="71689B55" ns2:textId="395FE732">
+          <w:p>
             <w:pPr>
               <w:pStyle w:val="2"/>
               <w:spacing w:line="240" w:lineRule="auto"/>
@@ -8362,7 +8362,7 @@
             <w:tcW w:w="4111" w:type="dxa"/>
             <w:hideMark/>
           </w:tcPr>
-          <w:p ns2:paraId="6EE9514D" ns2:textId="77777777">
+          <w:p>
             <w:pPr>
               <w:pStyle w:val="2"/>
               <w:spacing w:line="240" w:lineRule="auto"/>
@@ -8380,7 +8380,7 @@
               <w:t xml:space="preserve">了解课程任务与数字人视频流程</w:t>
             </w:r>
           </w:p>
-          <w:p ns2:paraId="5B85D5F5" ns2:textId="77777777">
+          <w:p>
             <w:pPr>
               <w:pStyle w:val="2"/>
               <w:spacing w:line="240" w:lineRule="auto"/>
@@ -8398,7 +8398,7 @@
               <w:t xml:space="preserve">理解合成内容的基本特点</w:t>
             </w:r>
           </w:p>
-          <w:p ns2:paraId="6E005056" ns2:textId="77777777">
+          <w:p>
             <w:pPr>
               <w:pStyle w:val="2"/>
               <w:spacing w:line="240" w:lineRule="auto"/>
@@ -8416,7 +8416,7 @@
               <w:t xml:space="preserve">掌握肖像权、声音授权与标识要求</w:t>
             </w:r>
           </w:p>
-          <w:p ns2:paraId="551BF0CE" ns2:textId="386DF943">
+          <w:p>
             <w:pPr>
               <w:pStyle w:val="2"/>
               <w:spacing w:line="240" w:lineRule="auto"/>
@@ -8440,7 +8440,7 @@
             <w:tcW w:w="3977" w:type="dxa"/>
             <w:hideMark/>
           </w:tcPr>
-          <w:p ns2:paraId="10CEB8E5" ns2:textId="77777777">
+          <w:p>
             <w:pPr>
               <w:pStyle w:val="2"/>
               <w:spacing w:line="240" w:lineRule="auto"/>
@@ -8458,7 +8458,7 @@
               <w:t xml:space="preserve">讲授与案例辨析</w:t>
             </w:r>
           </w:p>
-          <w:p ns2:paraId="111B59B7" ns2:textId="77777777">
+          <w:p>
             <w:pPr>
               <w:pStyle w:val="2"/>
               <w:spacing w:line="240" w:lineRule="auto"/>
@@ -8476,7 +8476,7 @@
               <w:t xml:space="preserve">观看合规和不合规案例</w:t>
             </w:r>
           </w:p>
-          <w:p ns2:paraId="73A68B82" ns2:textId="77777777">
+          <w:p>
             <w:pPr>
               <w:pStyle w:val="2"/>
               <w:spacing w:line="240" w:lineRule="auto"/>
@@ -8494,7 +8494,7 @@
               <w:t xml:space="preserve">完成素材使用规范讨论。思政融入：尊重人格权益，依法合规使用技术。</w:t>
             </w:r>
           </w:p>
-          <w:p ns2:paraId="3FADBE5C" ns2:textId="77777777">
+          <w:p>
             <w:pPr>
               <w:pStyle w:val="2"/>
               <w:spacing w:line="240" w:lineRule="auto"/>
@@ -8512,7 +8512,7 @@
               <w:t xml:space="preserve"/>
             </w:r>
           </w:p>
-          <w:p ns2:paraId="2BF20274" ns2:textId="403DFA96">
+          <w:p>
             <w:pPr>
               <w:pStyle w:val="2"/>
               <w:spacing w:line="240" w:lineRule="auto"/>
@@ -8546,7 +8546,7 @@
             <w:vAlign w:val="center"/>
             <w:hideMark/>
           </w:tcPr>
-          <w:p ns2:paraId="7E54DA07" ns2:textId="77777777">
+          <w:p>
             <w:pPr>
               <w:pStyle w:val="2"/>
               <w:spacing w:line="500" w:lineRule="exact"/>
@@ -8566,14 +8566,14 @@
           </w:p>
         </w:tc>
       </w:tr>
-      <w:tr ns2:paraId="5CE485C2" ns2:textId="77777777">
+      <w:tr>
         <w:tc>
           <w:tcPr>
             <w:tcW w:w="0" w:type="auto"/>
             <w:vAlign w:val="center"/>
             <w:hideMark/>
           </w:tcPr>
-          <w:p ns2:paraId="00D0B4CF" ns2:textId="77777777">
+          <w:p>
             <w:pPr>
               <w:jc w:val="left"/>
               <w:rPr>
@@ -8595,7 +8595,7 @@
             <w:tcW w:w="1780" w:type="dxa"/>
             <w:hideMark/>
           </w:tcPr>
-          <w:p ns2:paraId="61B525BD" ns2:textId="77777777">
+          <w:p>
             <w:pPr>
               <w:rPr>
                 <w:rFonts w:ascii="宋体" w:hAnsi="宋体"/>
@@ -8616,7 +8616,7 @@
             <w:tcW w:w="2834" w:type="dxa"/>
             <w:hideMark/>
           </w:tcPr>
-          <w:p ns2:paraId="6FA055C2" ns2:textId="6361699C">
+          <w:p>
             <w:pPr>
               <w:rPr>
                 <w:rFonts w:ascii="宋体" w:hAnsi="宋体"/>
@@ -8652,7 +8652,7 @@
               <w:t/>
             </w:r>
           </w:p>
-          <w:p ns2:paraId="24B1238D" ns2:textId="21C90C0C">
+          <w:p>
             <w:pPr>
               <w:rPr>
                 <w:rFonts w:ascii="宋体" w:hAnsi="宋体"/>
@@ -8695,7 +8695,7 @@
               <w:t/>
             </w:r>
           </w:p>
-          <w:p ns2:paraId="328F78C4" ns2:textId="77777777">
+          <w:p>
             <w:pPr>
               <w:rPr>
                 <w:rFonts w:ascii="宋体" w:hAnsi="宋体"/>
@@ -8710,7 +8710,7 @@
               <w:t xml:space="preserve">校园、专业和邮政服务场景选题</w:t>
             </w:r>
           </w:p>
-          <w:p ns2:paraId="7D75BADE" ns2:textId="3AADA493">
+          <w:p>
             <w:pPr>
               <w:rPr>
                 <w:rFonts w:ascii="宋体" w:hAnsi="宋体"/>
@@ -8731,7 +8731,7 @@
             <w:tcW w:w="4111" w:type="dxa"/>
             <w:hideMark/>
           </w:tcPr>
-          <w:p ns2:paraId="6035D16A" ns2:textId="77777777">
+          <w:p>
             <w:pPr>
               <w:rPr>
                 <w:rFonts w:ascii="宋体" w:hAnsi="宋体"/>
@@ -8746,7 +8746,7 @@
               <w:t xml:space="preserve">能够结合目标受众确定选题</w:t>
             </w:r>
           </w:p>
-          <w:p ns2:paraId="6DE682A8" ns2:textId="77777777">
+          <w:p>
             <w:pPr>
               <w:rPr>
                 <w:rFonts w:ascii="宋体" w:hAnsi="宋体"/>
@@ -8761,7 +8761,7 @@
               <w:t xml:space="preserve">能够界定视频用途、受众与传播边界</w:t>
             </w:r>
           </w:p>
-          <w:p ns2:paraId="151D22A3" ns2:textId="77777777">
+          <w:p>
             <w:pPr>
               <w:rPr>
                 <w:rFonts w:ascii="宋体" w:hAnsi="宋体"/>
@@ -8776,7 +8776,7 @@
               <w:t xml:space="preserve">能够核验关键事实</w:t>
             </w:r>
           </w:p>
-          <w:p ns2:paraId="288EE1F1" ns2:textId="3F2F5002">
+          <w:p>
             <w:pPr>
               <w:rPr>
                 <w:rFonts w:ascii="宋体" w:hAnsi="宋体"/>
@@ -8797,7 +8797,7 @@
             <w:tcW w:w="3977" w:type="dxa"/>
             <w:hideMark/>
           </w:tcPr>
-          <w:p ns2:paraId="71126ACD" ns2:textId="77777777">
+          <w:p>
             <w:pPr>
               <w:rPr>
                 <w:rFonts w:ascii="宋体" w:hAnsi="宋体"/>
@@ -8812,7 +8812,7 @@
               <w:t xml:space="preserve">任务驱动：分析不同场景需求</w:t>
             </w:r>
           </w:p>
-          <w:p ns2:paraId="6DA26A12" ns2:textId="77777777">
+          <w:p>
             <w:pPr>
               <w:rPr>
                 <w:rFonts w:ascii="宋体" w:hAnsi="宋体"/>
@@ -8827,7 +8827,7 @@
               <w:t xml:space="preserve">小组确定选题与传播目标</w:t>
             </w:r>
           </w:p>
-          <w:p ns2:paraId="56555740" ns2:textId="77777777">
+          <w:p>
             <w:pPr>
               <w:rPr>
                 <w:rFonts w:ascii="宋体" w:hAnsi="宋体"/>
@@ -8842,7 +8842,7 @@
               <w:t xml:space="preserve">教师示范选题单。</w:t>
             </w:r>
           </w:p>
-          <w:p ns2:paraId="7C2529E9" ns2:textId="77777777">
+          <w:p>
             <w:pPr>
               <w:rPr>
                 <w:rFonts w:ascii="宋体" w:hAnsi="宋体"/>
@@ -8857,7 +8857,7 @@
               <w:t xml:space="preserve"/>
             </w:r>
           </w:p>
-          <w:p ns2:paraId="0C7EA7CE" ns2:textId="6AF07B96">
+          <w:p>
             <w:pPr>
               <w:rPr>
                 <w:rFonts w:ascii="宋体" w:hAnsi="宋体"/>
@@ -8888,7 +8888,7 @@
             <w:vAlign w:val="center"/>
             <w:hideMark/>
           </w:tcPr>
-          <w:p ns2:paraId="71F847B9" ns2:textId="77777777">
+          <w:p>
             <w:pPr>
               <w:rPr>
                 <w:rFonts w:ascii="宋体" w:hAnsi="宋体"/>
@@ -8905,14 +8905,14 @@
           </w:p>
         </w:tc>
       </w:tr>
-      <w:tr ns2:paraId="453D39BC" ns2:textId="77777777">
+      <w:tr>
         <w:tc>
           <w:tcPr>
             <w:tcW w:w="0" w:type="auto"/>
             <w:vAlign w:val="center"/>
             <w:hideMark/>
           </w:tcPr>
-          <w:p ns2:paraId="45EC3F90" ns2:textId="77777777">
+          <w:p>
             <w:pPr>
               <w:jc w:val="left"/>
               <w:rPr>
@@ -8934,7 +8934,7 @@
             <w:tcW w:w="1780" w:type="dxa"/>
             <w:hideMark/>
           </w:tcPr>
-          <w:p ns2:paraId="134F5A39" ns2:textId="01E4312E">
+          <w:p>
             <w:pPr>
               <w:rPr>
                 <w:rFonts w:ascii="宋体" w:hAnsi="宋体"/>
@@ -8992,7 +8992,7 @@
             <w:tcW w:w="2834" w:type="dxa"/>
             <w:hideMark/>
           </w:tcPr>
-          <w:p ns2:paraId="159302BA" ns2:textId="77777777">
+          <w:p>
             <w:pPr>
               <w:rPr>
                 <w:rFonts w:ascii="宋体" w:hAnsi="宋体"/>
@@ -9007,7 +9007,7 @@
               <w:t xml:space="preserve">短视频结构</w:t>
             </w:r>
           </w:p>
-          <w:p ns2:paraId="7525BB4C" ns2:textId="77777777">
+          <w:p>
             <w:pPr>
               <w:rPr>
                 <w:rFonts w:ascii="宋体" w:hAnsi="宋体"/>
@@ -9038,7 +9038,7 @@
               <w:t/>
             </w:r>
           </w:p>
-          <w:p ns2:paraId="69B9C624" ns2:textId="77777777">
+          <w:p>
             <w:pPr>
               <w:rPr>
                 <w:rFonts w:ascii="宋体" w:hAnsi="宋体"/>
@@ -9053,7 +9053,7 @@
               <w:t xml:space="preserve">开场、主体与收束</w:t>
             </w:r>
           </w:p>
-          <w:p ns2:paraId="0DDD7934" ns2:textId="5F4A3AE4">
+          <w:p>
             <w:pPr>
               <w:rPr>
                 <w:rFonts w:ascii="宋体" w:hAnsi="宋体"/>
@@ -9089,7 +9089,7 @@
               <w:t/>
             </w:r>
           </w:p>
-          <w:p ns2:paraId="6644E730" ns2:textId="16F34652">
+          <w:p>
             <w:pPr>
               <w:rPr>
                 <w:rFonts w:ascii="宋体" w:hAnsi="宋体"/>
@@ -9110,7 +9110,7 @@
             <w:tcW w:w="4111" w:type="dxa"/>
             <w:hideMark/>
           </w:tcPr>
-          <w:p ns2:paraId="2BC3E8EE" ns2:textId="77777777">
+          <w:p>
             <w:pPr>
               <w:rPr>
                 <w:rFonts w:ascii="宋体" w:hAnsi="宋体"/>
@@ -9141,7 +9141,7 @@
               <w:t/>
             </w:r>
           </w:p>
-          <w:p ns2:paraId="439DB7D9" ns2:textId="77777777">
+          <w:p>
             <w:pPr>
               <w:rPr>
                 <w:rFonts w:ascii="宋体" w:hAnsi="宋体"/>
@@ -9156,7 +9156,7 @@
               <w:t xml:space="preserve">能够完成分镜表与画面描述</w:t>
             </w:r>
           </w:p>
-          <w:p ns2:paraId="45015E9D" ns2:textId="77777777">
+          <w:p>
             <w:pPr>
               <w:rPr>
                 <w:rFonts w:ascii="宋体" w:hAnsi="宋体"/>
@@ -9171,7 +9171,7 @@
               <w:t xml:space="preserve"/>
             </w:r>
           </w:p>
-          <w:p ns2:paraId="7C661C43" ns2:textId="14A2CF8F">
+          <w:p>
             <w:pPr>
               <w:rPr>
                 <w:rFonts w:ascii="宋体" w:hAnsi="宋体"/>
@@ -9192,7 +9192,7 @@
             <w:tcW w:w="3977" w:type="dxa"/>
             <w:hideMark/>
           </w:tcPr>
-          <w:p ns2:paraId="32EF9096" ns2:textId="77777777">
+          <w:p>
             <w:pPr>
               <w:rPr>
                 <w:rFonts w:ascii="宋体" w:hAnsi="宋体"/>
@@ -9207,7 +9207,7 @@
               <w:t xml:space="preserve">示范讲解、脚本改写、同伴互评</w:t>
             </w:r>
           </w:p>
-          <w:p ns2:paraId="00F480E0" ns2:textId="77777777">
+          <w:p>
             <w:pPr>
               <w:rPr>
                 <w:rFonts w:ascii="宋体" w:hAnsi="宋体"/>
@@ -9222,7 +9222,7 @@
               <w:t xml:space="preserve">强调准确表达和内容责任。</w:t>
             </w:r>
           </w:p>
-          <w:p ns2:paraId="1933EBE6" ns2:textId="77777777">
+          <w:p>
             <w:pPr>
               <w:rPr>
                 <w:rFonts w:ascii="宋体" w:hAnsi="宋体"/>
@@ -9237,7 +9237,7 @@
               <w:t xml:space="preserve"/>
             </w:r>
           </w:p>
-          <w:p ns2:paraId="7313B5B1" ns2:textId="77777777">
+          <w:p>
             <w:pPr>
               <w:rPr>
                 <w:rFonts w:ascii="宋体" w:hAnsi="宋体"/>
@@ -9252,7 +9252,7 @@
               <w:t xml:space="preserve"/>
             </w:r>
           </w:p>
-          <w:p ns2:paraId="745731E5" ns2:textId="007332AD">
+          <w:p>
             <w:pPr>
               <w:rPr>
                 <w:rFonts w:ascii="宋体" w:hAnsi="宋体"/>
@@ -9283,7 +9283,7 @@
             <w:vAlign w:val="center"/>
             <w:hideMark/>
           </w:tcPr>
-          <w:p ns2:paraId="50220C43" ns2:textId="77777777">
+          <w:p>
             <w:pPr>
               <w:rPr>
                 <w:rFonts w:ascii="宋体" w:hAnsi="宋体"/>
@@ -9300,14 +9300,14 @@
           </w:p>
         </w:tc>
       </w:tr>
-      <w:tr ns2:paraId="1AC9D5A2" ns2:textId="77777777">
+      <w:tr>
         <w:tc>
           <w:tcPr>
             <w:tcW w:w="0" w:type="auto"/>
             <w:vAlign w:val="center"/>
             <w:hideMark/>
           </w:tcPr>
-          <w:p ns2:paraId="58DCC181" ns2:textId="77777777">
+          <w:p>
             <w:pPr>
               <w:jc w:val="left"/>
               <w:rPr>
@@ -9329,7 +9329,7 @@
             <w:tcW w:w="1780" w:type="dxa"/>
             <w:hideMark/>
           </w:tcPr>
-          <w:p ns2:paraId="27F85465" ns2:textId="5D9B455F">
+          <w:p>
             <w:pPr>
               <w:rPr>
                 <w:rFonts w:ascii="宋体" w:hAnsi="宋体"/>
@@ -9395,7 +9395,7 @@
             <w:tcW w:w="2834" w:type="dxa"/>
             <w:hideMark/>
           </w:tcPr>
-          <w:p ns2:paraId="44ED9A7A" ns2:textId="77777777">
+          <w:p>
             <w:pPr>
               <w:rPr>
                 <w:rFonts w:ascii="宋体" w:hAnsi="宋体"/>
@@ -9411,7 +9411,7 @@
               <w:t xml:space="preserve">数字人类型与风格</w:t>
             </w:r>
           </w:p>
-          <w:p ns2:paraId="0457D2F1" ns2:textId="77777777">
+          <w:p>
             <w:pPr>
               <w:rPr>
                 <w:rFonts w:ascii="宋体" w:hAnsi="宋体"/>
@@ -9427,7 +9427,7 @@
               <w:t xml:space="preserve">形象选择</w:t>
             </w:r>
           </w:p>
-          <w:p ns2:paraId="25CB245E" ns2:textId="77777777">
+          <w:p>
             <w:pPr>
               <w:rPr>
                 <w:rFonts w:ascii="宋体" w:hAnsi="宋体"/>
@@ -9442,7 +9442,7 @@
               <w:t xml:space="preserve">背景、服装、构图</w:t>
             </w:r>
           </w:p>
-          <w:p ns2:paraId="71082670" ns2:textId="19650773">
+          <w:p>
             <w:pPr>
               <w:rPr>
                 <w:rFonts w:ascii="宋体" w:hAnsi="宋体"/>
@@ -9478,7 +9478,7 @@
               <w:t/>
             </w:r>
           </w:p>
-          <w:p ns2:paraId="7CCA7B0F" ns2:textId="28F03EA1">
+          <w:p>
             <w:pPr>
               <w:rPr>
                 <w:rFonts w:ascii="宋体" w:hAnsi="宋体"/>
@@ -9520,7 +9520,7 @@
             <w:tcW w:w="4111" w:type="dxa"/>
             <w:hideMark/>
           </w:tcPr>
-          <w:p ns2:paraId="7E86362D" ns2:textId="77777777">
+          <w:p>
             <w:pPr>
               <w:rPr>
                 <w:rFonts w:ascii="宋体" w:hAnsi="宋体"/>
@@ -9536,7 +9536,7 @@
               <w:t xml:space="preserve">能够根据内容定位选择合适形象和视觉风格</w:t>
             </w:r>
           </w:p>
-          <w:p ns2:paraId="13FA5ED7" ns2:textId="77777777">
+          <w:p>
             <w:pPr>
               <w:rPr>
                 <w:rFonts w:ascii="宋体" w:hAnsi="宋体"/>
@@ -9552,7 +9552,7 @@
               <w:t xml:space="preserve">能够建立素材清单并核验授权</w:t>
             </w:r>
           </w:p>
-          <w:p ns2:paraId="5152B024" ns2:textId="77777777">
+          <w:p>
             <w:pPr>
               <w:rPr>
                 <w:rFonts w:ascii="宋体" w:hAnsi="宋体"/>
@@ -9567,7 +9567,7 @@
               <w:t xml:space="preserve"/>
             </w:r>
           </w:p>
-          <w:p ns2:paraId="7EDFDC84" ns2:textId="071525AA">
+          <w:p>
             <w:pPr>
               <w:rPr>
                 <w:rFonts w:ascii="宋体" w:hAnsi="宋体"/>
@@ -9588,7 +9588,7 @@
             <w:tcW w:w="3977" w:type="dxa"/>
             <w:hideMark/>
           </w:tcPr>
-          <w:p ns2:paraId="5D05F1DA" ns2:textId="77777777">
+          <w:p>
             <w:pPr>
               <w:rPr>
                 <w:rFonts w:ascii="宋体" w:hAnsi="宋体"/>
@@ -9604,7 +9604,7 @@
               <w:t xml:space="preserve">案例对比、素材筛查实操</w:t>
             </w:r>
           </w:p>
-          <w:p ns2:paraId="781AB2DE" ns2:textId="77777777">
+          <w:p>
             <w:pPr>
               <w:rPr>
                 <w:rFonts w:ascii="宋体" w:hAnsi="宋体"/>
@@ -9620,7 +9620,7 @@
               <w:t xml:space="preserve">不得未经许可克隆真实人物形象或声音。</w:t>
             </w:r>
           </w:p>
-          <w:p ns2:paraId="2B00A119" ns2:textId="77777777">
+          <w:p>
             <w:pPr>
               <w:rPr>
                 <w:rFonts w:ascii="宋体" w:hAnsi="宋体"/>
@@ -9635,7 +9635,7 @@
               <w:t xml:space="preserve"/>
             </w:r>
           </w:p>
-          <w:p ns2:paraId="3C5FDBBB" ns2:textId="77777777">
+          <w:p>
             <w:pPr>
               <w:rPr>
                 <w:rFonts w:ascii="宋体" w:hAnsi="宋体"/>
@@ -9666,7 +9666,7 @@
               <w:t/>
             </w:r>
           </w:p>
-          <w:p ns2:paraId="6D1BADB6" ns2:textId="533AFA23">
+          <w:p>
             <w:pPr>
               <w:rPr>
                 <w:rFonts w:ascii="宋体" w:hAnsi="宋体"/>
@@ -9697,7 +9697,7 @@
             <w:vAlign w:val="center"/>
             <w:hideMark/>
           </w:tcPr>
-          <w:p ns2:paraId="59E3FF66" ns2:textId="77777777">
+          <w:p>
             <w:pPr>
               <w:rPr>
                 <w:rFonts w:ascii="宋体" w:hAnsi="宋体"/>
@@ -9715,14 +9715,14 @@
           </w:p>
         </w:tc>
       </w:tr>
-      <w:tr ns2:paraId="02EAEE0C" ns2:textId="77777777">
+      <w:tr>
         <w:tc>
           <w:tcPr>
             <w:tcW w:w="0" w:type="auto"/>
             <w:vAlign w:val="center"/>
             <w:hideMark/>
           </w:tcPr>
-          <w:p ns2:paraId="4C1558B4" ns2:textId="77777777">
+          <w:p>
             <w:pPr>
               <w:jc w:val="left"/>
               <w:rPr>
@@ -9744,7 +9744,7 @@
             <w:tcW w:w="1780" w:type="dxa"/>
             <w:hideMark/>
           </w:tcPr>
-          <w:p ns2:paraId="69F8DBB6" ns2:textId="34705D36">
+          <w:p>
             <w:pPr>
               <w:rPr>
                 <w:rFonts w:ascii="宋体" w:hAnsi="宋体"/>
@@ -9786,7 +9786,7 @@
             <w:tcW w:w="2834" w:type="dxa"/>
             <w:hideMark/>
           </w:tcPr>
-          <w:p ns2:paraId="1AEA1549" ns2:textId="77777777">
+          <w:p>
             <w:pPr>
               <w:rPr>
                 <w:rFonts w:ascii="宋体" w:hAnsi="宋体"/>
@@ -9801,7 +9801,7 @@
               <w:t xml:space="preserve">数字人平台基本操作</w:t>
             </w:r>
           </w:p>
-          <w:p ns2:paraId="157D02D6" ns2:textId="77777777">
+          <w:p>
             <w:pPr>
               <w:rPr>
                 <w:rFonts w:ascii="宋体" w:hAnsi="宋体"/>
@@ -9816,7 +9816,7 @@
               <w:t xml:space="preserve">文本配音</w:t>
             </w:r>
           </w:p>
-          <w:p ns2:paraId="46378487" ns2:textId="118FEA1C">
+          <w:p>
             <w:pPr>
               <w:rPr>
                 <w:rFonts w:ascii="宋体" w:hAnsi="宋体"/>
@@ -9852,7 +9852,7 @@
               <w:t/>
             </w:r>
           </w:p>
-          <w:p ns2:paraId="76A07584" ns2:textId="13944B22">
+          <w:p>
             <w:pPr>
               <w:rPr>
                 <w:rFonts w:ascii="宋体" w:hAnsi="宋体"/>
@@ -9888,7 +9888,7 @@
               <w:t/>
             </w:r>
           </w:p>
-          <w:p ns2:paraId="0B11CBA8" ns2:textId="5AE3F7A6">
+          <w:p>
             <w:pPr>
               <w:rPr>
                 <w:rFonts w:ascii="宋体" w:hAnsi="宋体"/>
@@ -9909,7 +9909,7 @@
             <w:tcW w:w="4111" w:type="dxa"/>
             <w:hideMark/>
           </w:tcPr>
-          <w:p ns2:paraId="3747E974" ns2:textId="77777777">
+          <w:p>
             <w:pPr>
               <w:rPr>
                 <w:rFonts w:ascii="宋体" w:hAnsi="宋体"/>
@@ -9924,7 +9924,7 @@
               <w:t xml:space="preserve">能够完成数字人形象与脚本绑定</w:t>
             </w:r>
           </w:p>
-          <w:p ns2:paraId="470073A4" ns2:textId="77777777">
+          <w:p>
             <w:pPr>
               <w:rPr>
                 <w:rFonts w:ascii="宋体" w:hAnsi="宋体"/>
@@ -9939,7 +9939,7 @@
               <w:t xml:space="preserve">能够调整语音表达并输出试片</w:t>
             </w:r>
           </w:p>
-          <w:p ns2:paraId="66EE2100" ns2:textId="77777777">
+          <w:p>
             <w:pPr>
               <w:rPr>
                 <w:rFonts w:ascii="宋体" w:hAnsi="宋体"/>
@@ -9954,7 +9954,7 @@
               <w:t xml:space="preserve"/>
             </w:r>
           </w:p>
-          <w:p ns2:paraId="44BEAD25" ns2:textId="776132FE">
+          <w:p>
             <w:pPr>
               <w:rPr>
                 <w:rFonts w:ascii="宋体" w:hAnsi="宋体"/>
@@ -9975,7 +9975,7 @@
             <w:tcW w:w="3977" w:type="dxa"/>
             <w:hideMark/>
           </w:tcPr>
-          <w:p ns2:paraId="1590C5B6" ns2:textId="77777777">
+          <w:p>
             <w:pPr>
               <w:rPr>
                 <w:rFonts w:ascii="宋体" w:hAnsi="宋体"/>
@@ -9990,7 +9990,7 @@
               <w:t xml:space="preserve">教师演示后分步实操</w:t>
             </w:r>
           </w:p>
-          <w:p ns2:paraId="3447690B" ns2:textId="77777777">
+          <w:p>
             <w:pPr>
               <w:rPr>
                 <w:rFonts w:ascii="宋体" w:hAnsi="宋体"/>
@@ -10005,7 +10005,7 @@
               <w:t xml:space="preserve">试听比较、定位并修订表达问题。</w:t>
             </w:r>
           </w:p>
-          <w:p ns2:paraId="32D2EC8D" ns2:textId="77777777">
+          <w:p>
             <w:pPr>
               <w:rPr>
                 <w:rFonts w:ascii="宋体" w:hAnsi="宋体"/>
@@ -10020,7 +10020,7 @@
               <w:t xml:space="preserve"/>
             </w:r>
           </w:p>
-          <w:p ns2:paraId="354CF4D0" ns2:textId="77777777">
+          <w:p>
             <w:pPr>
               <w:rPr>
                 <w:rFonts w:ascii="宋体" w:hAnsi="宋体"/>
@@ -10035,7 +10035,7 @@
               <w:t xml:space="preserve"/>
             </w:r>
           </w:p>
-          <w:p ns2:paraId="6205385C" ns2:textId="09F9FD34">
+          <w:p>
             <w:pPr>
               <w:rPr>
                 <w:rFonts w:ascii="宋体" w:hAnsi="宋体"/>
@@ -10066,7 +10066,7 @@
             <w:vAlign w:val="center"/>
             <w:hideMark/>
           </w:tcPr>
-          <w:p ns2:paraId="7D500C0B" ns2:textId="77777777">
+          <w:p>
             <w:pPr>
               <w:rPr>
                 <w:rFonts w:ascii="宋体" w:hAnsi="宋体"/>
@@ -10083,14 +10083,14 @@
           </w:p>
         </w:tc>
       </w:tr>
-      <w:tr ns2:paraId="18E771DF" ns2:textId="77777777">
+      <w:tr>
         <w:tc>
           <w:tcPr>
             <w:tcW w:w="0" w:type="auto"/>
             <w:vAlign w:val="center"/>
             <w:hideMark/>
           </w:tcPr>
-          <w:p ns2:paraId="09BAF324" ns2:textId="77777777">
+          <w:p>
             <w:pPr>
               <w:jc w:val="left"/>
               <w:rPr>
@@ -10112,7 +10112,7 @@
             <w:tcW w:w="1780" w:type="dxa"/>
             <w:hideMark/>
           </w:tcPr>
-          <w:p ns2:paraId="640E6912" ns2:textId="6584ADD2">
+          <w:p>
             <w:pPr>
               <w:rPr>
                 <w:rFonts w:ascii="宋体" w:hAnsi="宋体"/>
@@ -10154,7 +10154,7 @@
             <w:tcW w:w="2834" w:type="dxa"/>
             <w:hideMark/>
           </w:tcPr>
-          <w:p ns2:paraId="37F4AB43" ns2:textId="77777777">
+          <w:p>
             <w:pPr>
               <w:rPr>
                 <w:rFonts w:ascii="宋体" w:hAnsi="宋体"/>
@@ -10169,7 +10169,7 @@
               <w:t xml:space="preserve">背景与场景设置</w:t>
             </w:r>
           </w:p>
-          <w:p ns2:paraId="00397A81" ns2:textId="77777777">
+          <w:p>
             <w:pPr>
               <w:rPr>
                 <w:rFonts w:ascii="宋体" w:hAnsi="宋体"/>
@@ -10184,7 +10184,7 @@
               <w:t xml:space="preserve">镜头构图</w:t>
             </w:r>
           </w:p>
-          <w:p ns2:paraId="5ADFF91A" ns2:textId="77777777">
+          <w:p>
             <w:pPr>
               <w:rPr>
                 <w:rFonts w:ascii="宋体" w:hAnsi="宋体"/>
@@ -10199,7 +10199,7 @@
               <w:t xml:space="preserve">画面层次</w:t>
             </w:r>
           </w:p>
-          <w:p ns2:paraId="6BB1BE19" ns2:textId="77777777">
+          <w:p>
             <w:pPr>
               <w:rPr>
                 <w:rFonts w:ascii="宋体" w:hAnsi="宋体"/>
@@ -10214,7 +10214,7 @@
               <w:t xml:space="preserve">AI生成素材筛选与真实性检查</w:t>
             </w:r>
           </w:p>
-          <w:p ns2:paraId="17E1C2D4" ns2:textId="5D644B83">
+          <w:p>
             <w:pPr>
               <w:rPr>
                 <w:rFonts w:ascii="宋体" w:hAnsi="宋体"/>
@@ -10235,7 +10235,7 @@
             <w:tcW w:w="4111" w:type="dxa"/>
             <w:hideMark/>
           </w:tcPr>
-          <w:p ns2:paraId="748F67F5" ns2:textId="77777777">
+          <w:p>
             <w:pPr>
               <w:rPr>
                 <w:rFonts w:ascii="宋体" w:hAnsi="宋体"/>
@@ -10250,7 +10250,7 @@
               <w:t xml:space="preserve">能够制作与脚本匹配的场景画面</w:t>
             </w:r>
           </w:p>
-          <w:p ns2:paraId="163F67A0" ns2:textId="77777777">
+          <w:p>
             <w:pPr>
               <w:rPr>
                 <w:rFonts w:ascii="宋体" w:hAnsi="宋体"/>
@@ -10265,7 +10265,7 @@
               <w:t xml:space="preserve">能够检查生成素材的逻辑和真实性</w:t>
             </w:r>
           </w:p>
-          <w:p ns2:paraId="0CF40FB6" ns2:textId="77777777">
+          <w:p>
             <w:pPr>
               <w:rPr>
                 <w:rFonts w:ascii="宋体" w:hAnsi="宋体"/>
@@ -10280,7 +10280,7 @@
               <w:t xml:space="preserve"/>
             </w:r>
           </w:p>
-          <w:p ns2:paraId="4AFC0DC4" ns2:textId="19773334">
+          <w:p>
             <w:pPr>
               <w:rPr>
                 <w:rFonts w:ascii="宋体" w:hAnsi="宋体"/>
@@ -10301,7 +10301,7 @@
             <w:tcW w:w="3977" w:type="dxa"/>
             <w:hideMark/>
           </w:tcPr>
-          <w:p ns2:paraId="727A3E96" ns2:textId="77777777">
+          <w:p>
             <w:pPr>
               <w:rPr>
                 <w:rFonts w:ascii="宋体" w:hAnsi="宋体"/>
@@ -10316,7 +10316,7 @@
               <w:t xml:space="preserve">任务工单指导</w:t>
             </w:r>
           </w:p>
-          <w:p ns2:paraId="1F299B83" ns2:textId="77777777">
+          <w:p>
             <w:pPr>
               <w:rPr>
                 <w:rFonts w:ascii="宋体" w:hAnsi="宋体"/>
@@ -10331,7 +10331,7 @@
               <w:t xml:space="preserve">用同一脚本制作不同视觉方案并说明选择理由。</w:t>
             </w:r>
           </w:p>
-          <w:p ns2:paraId="1B965786" ns2:textId="77777777">
+          <w:p>
             <w:pPr>
               <w:rPr>
                 <w:rFonts w:ascii="宋体" w:hAnsi="宋体"/>
@@ -10346,7 +10346,7 @@
               <w:t xml:space="preserve"/>
             </w:r>
           </w:p>
-          <w:p ns2:paraId="670D0361" ns2:textId="77777777">
+          <w:p>
             <w:pPr>
               <w:rPr>
                 <w:rFonts w:ascii="宋体" w:hAnsi="宋体"/>
@@ -10361,7 +10361,7 @@
               <w:t xml:space="preserve"/>
             </w:r>
           </w:p>
-          <w:p ns2:paraId="42A8EE5F" ns2:textId="22040D56">
+          <w:p>
             <w:pPr>
               <w:rPr>
                 <w:rFonts w:ascii="宋体" w:hAnsi="宋体"/>
@@ -10392,7 +10392,7 @@
             <w:vAlign w:val="center"/>
             <w:hideMark/>
           </w:tcPr>
-          <w:p ns2:paraId="65CD8801" ns2:textId="77777777">
+          <w:p>
             <w:pPr>
               <w:rPr>
                 <w:rFonts w:ascii="宋体" w:hAnsi="宋体"/>
@@ -10409,14 +10409,14 @@
           </w:p>
         </w:tc>
       </w:tr>
-      <w:tr ns2:paraId="037E1701" ns2:textId="77777777">
+      <w:tr>
         <w:tc>
           <w:tcPr>
             <w:tcW w:w="0" w:type="auto"/>
             <w:vAlign w:val="center"/>
             <w:hideMark/>
           </w:tcPr>
-          <w:p ns2:paraId="020833E2" ns2:textId="77777777">
+          <w:p>
             <w:pPr>
               <w:jc w:val="left"/>
               <w:rPr>
@@ -10438,7 +10438,7 @@
             <w:tcW w:w="1780" w:type="dxa"/>
             <w:hideMark/>
           </w:tcPr>
-          <w:p ns2:paraId="0FBB1D9A" ns2:textId="4FC862C6">
+          <w:p>
             <w:pPr>
               <w:rPr>
                 <w:rFonts w:ascii="宋体" w:hAnsi="宋体"/>
@@ -10480,7 +10480,7 @@
             <w:tcW w:w="2834" w:type="dxa"/>
             <w:hideMark/>
           </w:tcPr>
-          <w:p ns2:paraId="477C136B" ns2:textId="77777777">
+          <w:p>
             <w:pPr>
               <w:rPr>
                 <w:rFonts w:ascii="宋体" w:hAnsi="宋体"/>
@@ -10495,7 +10495,7 @@
               <w:t xml:space="preserve">视频片段剪辑</w:t>
             </w:r>
           </w:p>
-          <w:p ns2:paraId="26399611" ns2:textId="77777777">
+          <w:p>
             <w:pPr>
               <w:rPr>
                 <w:rFonts w:ascii="宋体" w:hAnsi="宋体"/>
@@ -10510,7 +10510,7 @@
               <w:t xml:space="preserve">字幕校对</w:t>
             </w:r>
           </w:p>
-          <w:p ns2:paraId="26546671" ns2:textId="77777777">
+          <w:p>
             <w:pPr>
               <w:rPr>
                 <w:rFonts w:ascii="宋体" w:hAnsi="宋体"/>
@@ -10525,7 +10525,7 @@
               <w:t xml:space="preserve">配乐音量</w:t>
             </w:r>
           </w:p>
-          <w:p ns2:paraId="60379209" ns2:textId="77777777">
+          <w:p>
             <w:pPr>
               <w:rPr>
                 <w:rFonts w:ascii="宋体" w:hAnsi="宋体"/>
@@ -10540,7 +10540,7 @@
               <w:t xml:space="preserve">片头片尾</w:t>
             </w:r>
           </w:p>
-          <w:p ns2:paraId="0E508927" ns2:textId="77777777">
+          <w:p>
             <w:pPr>
               <w:rPr>
                 <w:rFonts w:ascii="宋体" w:hAnsi="宋体"/>
@@ -10555,7 +10555,7 @@
               <w:t xml:space="preserve">画幅与导出参数</w:t>
             </w:r>
           </w:p>
-          <w:p ns2:paraId="186B4EC7" ns2:textId="4EEA51CA">
+          <w:p>
             <w:pPr>
               <w:rPr>
                 <w:rFonts w:ascii="宋体" w:hAnsi="宋体"/>
@@ -10576,7 +10576,7 @@
             <w:tcW w:w="4111" w:type="dxa"/>
             <w:hideMark/>
           </w:tcPr>
-          <w:p ns2:paraId="1CD8C51D" ns2:textId="77777777">
+          <w:p>
             <w:pPr>
               <w:rPr>
                 <w:rFonts w:ascii="宋体" w:hAnsi="宋体"/>
@@ -10591,7 +10591,7 @@
               <w:t xml:space="preserve">能够完成基本剪辑、字幕校对和音画平衡</w:t>
             </w:r>
           </w:p>
-          <w:p ns2:paraId="245F3A1B" ns2:textId="77777777">
+          <w:p>
             <w:pPr>
               <w:rPr>
                 <w:rFonts w:ascii="宋体" w:hAnsi="宋体"/>
@@ -10606,7 +10606,7 @@
               <w:t xml:space="preserve">能够按发布要求导出成片</w:t>
             </w:r>
           </w:p>
-          <w:p ns2:paraId="12E9437B" ns2:textId="77777777">
+          <w:p>
             <w:pPr>
               <w:rPr>
                 <w:rFonts w:ascii="宋体" w:hAnsi="宋体"/>
@@ -10621,7 +10621,7 @@
               <w:t xml:space="preserve"/>
             </w:r>
           </w:p>
-          <w:p ns2:paraId="24F33E90" ns2:textId="77777777">
+          <w:p>
             <w:pPr>
               <w:rPr>
                 <w:rFonts w:ascii="宋体" w:hAnsi="宋体"/>
@@ -10636,7 +10636,7 @@
               <w:t xml:space="preserve"/>
             </w:r>
           </w:p>
-          <w:p ns2:paraId="67B9EAC1" ns2:textId="19CE933D">
+          <w:p>
             <w:pPr>
               <w:rPr>
                 <w:rFonts w:ascii="宋体" w:hAnsi="宋体"/>
@@ -10657,7 +10657,7 @@
             <w:tcW w:w="3977" w:type="dxa"/>
             <w:hideMark/>
           </w:tcPr>
-          <w:p ns2:paraId="6A65A7F6" ns2:textId="77777777">
+          <w:p>
             <w:pPr>
               <w:rPr>
                 <w:rFonts w:ascii="宋体" w:hAnsi="宋体"/>
@@ -10672,7 +10672,7 @@
               <w:t xml:space="preserve">操作演示与上机实训</w:t>
             </w:r>
           </w:p>
-          <w:p ns2:paraId="105D2F68" ns2:textId="77777777">
+          <w:p>
             <w:pPr>
               <w:rPr>
                 <w:rFonts w:ascii="宋体" w:hAnsi="宋体"/>
@@ -10687,7 +10687,7 @@
               <w:t xml:space="preserve">关注字幕准确、音量适当和无侵权素材。</w:t>
             </w:r>
           </w:p>
-          <w:p ns2:paraId="5E12D602" ns2:textId="77777777">
+          <w:p>
             <w:pPr>
               <w:rPr>
                 <w:rFonts w:ascii="宋体" w:hAnsi="宋体"/>
@@ -10702,7 +10702,7 @@
               <w:t xml:space="preserve"/>
             </w:r>
           </w:p>
-          <w:p ns2:paraId="532CCB23" ns2:textId="77777777">
+          <w:p>
             <w:pPr>
               <w:rPr>
                 <w:rFonts w:ascii="宋体" w:hAnsi="宋体"/>
@@ -10733,7 +10733,7 @@
               <w:t/>
             </w:r>
           </w:p>
-          <w:p ns2:paraId="626FCC5F" ns2:textId="258D76DF">
+          <w:p>
             <w:pPr>
               <w:rPr>
                 <w:rFonts w:ascii="宋体" w:hAnsi="宋体"/>
@@ -10764,7 +10764,7 @@
             <w:vAlign w:val="center"/>
             <w:hideMark/>
           </w:tcPr>
-          <w:p ns2:paraId="760045AE" ns2:textId="77777777">
+          <w:p>
             <w:pPr>
               <w:rPr>
                 <w:rFonts w:ascii="宋体" w:hAnsi="宋体"/>
@@ -10781,14 +10781,14 @@
           </w:p>
         </w:tc>
       </w:tr>
-      <w:tr ns2:paraId="438FF6DE" ns2:textId="77777777">
+      <w:tr>
         <w:tc>
           <w:tcPr>
             <w:tcW w:w="0" w:type="auto"/>
             <w:vAlign w:val="center"/>
             <w:hideMark/>
           </w:tcPr>
-          <w:p ns2:paraId="17453F55" ns2:textId="77777777">
+          <w:p>
             <w:pPr>
               <w:jc w:val="left"/>
               <w:rPr>
@@ -10810,7 +10810,7 @@
             <w:tcW w:w="1780" w:type="dxa"/>
             <w:hideMark/>
           </w:tcPr>
-          <w:p ns2:paraId="569B5BAC" ns2:textId="7B969F68">
+          <w:p>
             <w:pPr>
               <w:rPr>
                 <w:rFonts w:ascii="宋体" w:hAnsi="宋体"/>
@@ -10860,7 +10860,7 @@
             <w:tcW w:w="2834" w:type="dxa"/>
             <w:hideMark/>
           </w:tcPr>
-          <w:p ns2:paraId="77715BAF" ns2:textId="77777777">
+          <w:p>
             <w:pPr>
               <w:rPr>
                 <w:rFonts w:ascii="宋体" w:hAnsi="宋体"/>
@@ -10876,7 +10876,7 @@
               <w:t xml:space="preserve">平台规格</w:t>
             </w:r>
           </w:p>
-          <w:p ns2:paraId="25A2E7FA" ns2:textId="77777777">
+          <w:p>
             <w:pPr>
               <w:rPr>
                 <w:rFonts w:ascii="宋体" w:hAnsi="宋体"/>
@@ -10892,7 +10892,7 @@
               <w:t xml:space="preserve">标题与封面</w:t>
             </w:r>
           </w:p>
-          <w:p ns2:paraId="1B24DD95" ns2:textId="77777777">
+          <w:p>
             <w:pPr>
               <w:rPr>
                 <w:rFonts w:ascii="宋体" w:hAnsi="宋体"/>
@@ -10907,7 +10907,7 @@
               <w:t xml:space="preserve">无障碍字幕</w:t>
             </w:r>
           </w:p>
-          <w:p ns2:paraId="16B9BCB0" ns2:textId="77777777">
+          <w:p>
             <w:pPr>
               <w:rPr>
                 <w:rFonts w:ascii="宋体" w:hAnsi="宋体"/>
@@ -10922,7 +10922,7 @@
               <w:t xml:space="preserve">合成内容标识</w:t>
             </w:r>
           </w:p>
-          <w:p ns2:paraId="2118AD61" ns2:textId="705562BC">
+          <w:p>
             <w:pPr>
               <w:rPr>
                 <w:rFonts w:ascii="宋体" w:hAnsi="宋体"/>
@@ -10959,7 +10959,7 @@
             <w:tcW w:w="4111" w:type="dxa"/>
             <w:hideMark/>
           </w:tcPr>
-          <w:p ns2:paraId="00B5B7B3" ns2:textId="77777777">
+          <w:p>
             <w:pPr>
               <w:rPr>
                 <w:rFonts w:ascii="宋体" w:hAnsi="宋体"/>
@@ -10975,7 +10975,7 @@
               <w:t xml:space="preserve">能够制作标题封面并按要求标识合成内容</w:t>
             </w:r>
           </w:p>
-          <w:p ns2:paraId="1894679B" ns2:textId="77777777">
+          <w:p>
             <w:pPr>
               <w:rPr>
                 <w:rFonts w:ascii="宋体" w:hAnsi="宋体"/>
@@ -10991,7 +10991,7 @@
               <w:t xml:space="preserve">能够依据反馈提出修改方案</w:t>
             </w:r>
           </w:p>
-          <w:p ns2:paraId="02718322" ns2:textId="77777777">
+          <w:p>
             <w:pPr>
               <w:rPr>
                 <w:rFonts w:ascii="宋体" w:hAnsi="宋体"/>
@@ -11006,7 +11006,7 @@
               <w:t xml:space="preserve"/>
             </w:r>
           </w:p>
-          <w:p ns2:paraId="4AC01830" ns2:textId="10575C02">
+          <w:p>
             <w:pPr>
               <w:rPr>
                 <w:rFonts w:ascii="宋体" w:hAnsi="宋体"/>
@@ -11043,7 +11043,7 @@
             <w:tcW w:w="3977" w:type="dxa"/>
             <w:hideMark/>
           </w:tcPr>
-          <w:p ns2:paraId="0CBB7840" ns2:textId="77777777">
+          <w:p>
             <w:pPr>
               <w:rPr>
                 <w:rFonts w:ascii="宋体" w:hAnsi="宋体"/>
@@ -11059,7 +11059,7 @@
               <w:t xml:space="preserve">发布案例分析、作品互评</w:t>
             </w:r>
           </w:p>
-          <w:p ns2:paraId="31AA785D" ns2:textId="77777777">
+          <w:p>
             <w:pPr>
               <w:rPr>
                 <w:rFonts w:ascii="宋体" w:hAnsi="宋体"/>
@@ -11091,7 +11091,7 @@
               <w:t/>
             </w:r>
           </w:p>
-          <w:p ns2:paraId="4B26B6D6" ns2:textId="77777777">
+          <w:p>
             <w:pPr>
               <w:rPr>
                 <w:rFonts w:ascii="宋体" w:hAnsi="宋体"/>
@@ -11106,7 +11106,7 @@
               <w:t xml:space="preserve"/>
             </w:r>
           </w:p>
-          <w:p ns2:paraId="06725B49" ns2:textId="77777777">
+          <w:p>
             <w:pPr>
               <w:rPr>
                 <w:rFonts w:ascii="宋体" w:hAnsi="宋体"/>
@@ -11121,7 +11121,7 @@
               <w:t xml:space="preserve"/>
             </w:r>
           </w:p>
-          <w:p ns2:paraId="466CBAE2" ns2:textId="4C1C1B35">
+          <w:p>
             <w:pPr>
               <w:rPr>
                 <w:rFonts w:ascii="宋体" w:hAnsi="宋体"/>
@@ -11152,7 +11152,7 @@
             <w:vAlign w:val="center"/>
             <w:hideMark/>
           </w:tcPr>
-          <w:p ns2:paraId="544A5AF3" ns2:textId="77777777">
+          <w:p>
             <w:pPr>
               <w:rPr>
                 <w:rFonts w:ascii="宋体" w:hAnsi="宋体"/>
@@ -11170,14 +11170,14 @@
           </w:p>
         </w:tc>
       </w:tr>
-      <w:tr ns2:paraId="1D4F611A" ns2:textId="77777777">
+      <w:tr>
         <w:tc>
           <w:tcPr>
             <w:tcW w:w="0" w:type="auto"/>
             <w:vAlign w:val="center"/>
             <w:hideMark/>
           </w:tcPr>
-          <w:p ns2:paraId="04FE6D48" ns2:textId="77777777">
+          <w:p>
             <w:pPr>
               <w:jc w:val="left"/>
               <w:rPr>
@@ -11199,7 +11199,7 @@
             <w:tcW w:w="1780" w:type="dxa"/>
             <w:hideMark/>
           </w:tcPr>
-          <w:p ns2:paraId="2FB31356" ns2:textId="11FC3A6A">
+          <w:p>
             <w:pPr>
               <w:rPr>
                 <w:rFonts w:ascii="宋体" w:hAnsi="宋体"/>
@@ -11241,7 +11241,7 @@
             <w:tcW w:w="2834" w:type="dxa"/>
             <w:hideMark/>
           </w:tcPr>
-          <w:p ns2:paraId="57836BD7" ns2:textId="77777777">
+          <w:p>
             <w:pPr>
               <w:rPr>
                 <w:rFonts w:ascii="宋体" w:hAnsi="宋体"/>
@@ -11256,7 +11256,7 @@
               <w:t xml:space="preserve">完成需求分析、脚本分镜、形象与素材、数字人驱动、剪辑包装、合规检查和成片展示</w:t>
             </w:r>
           </w:p>
-          <w:p ns2:paraId="3FD09CB8" ns2:textId="77777777">
+          <w:p>
             <w:pPr>
               <w:rPr>
                 <w:rFonts w:ascii="宋体" w:hAnsi="宋体"/>
@@ -11271,7 +11271,7 @@
               <w:t xml:space="preserve"/>
             </w:r>
           </w:p>
-          <w:p ns2:paraId="7B140066" ns2:textId="77777777">
+          <w:p>
             <w:pPr>
               <w:rPr>
                 <w:rFonts w:ascii="宋体" w:hAnsi="宋体"/>
@@ -11286,7 +11286,7 @@
               <w:t xml:space="preserve"/>
             </w:r>
           </w:p>
-          <w:p ns2:paraId="0BBF538F" ns2:textId="77777777">
+          <w:p>
             <w:pPr>
               <w:rPr>
                 <w:rFonts w:ascii="宋体" w:hAnsi="宋体"/>
@@ -11301,7 +11301,7 @@
               <w:t xml:space="preserve"/>
             </w:r>
           </w:p>
-          <w:p ns2:paraId="03F99C38" ns2:textId="49603ADF">
+          <w:p>
             <w:pPr>
               <w:rPr>
                 <w:rFonts w:ascii="宋体" w:hAnsi="宋体"/>
@@ -11322,7 +11322,7 @@
             <w:tcW w:w="4111" w:type="dxa"/>
             <w:hideMark/>
           </w:tcPr>
-          <w:p ns2:paraId="6CBA7CD9" ns2:textId="77777777">
+          <w:p>
             <w:pPr>
               <w:rPr>
                 <w:rFonts w:ascii="宋体" w:hAnsi="宋体"/>
@@ -11337,7 +11337,7 @@
               <w:t xml:space="preserve">能够独立或协作完成一条主题明确、表达准确、技术合格且合规的数字人短视频</w:t>
             </w:r>
           </w:p>
-          <w:p ns2:paraId="4816E870" ns2:textId="77777777">
+          <w:p>
             <w:pPr>
               <w:rPr>
                 <w:rFonts w:ascii="宋体" w:hAnsi="宋体"/>
@@ -11352,7 +11352,7 @@
               <w:t xml:space="preserve"/>
             </w:r>
           </w:p>
-          <w:p ns2:paraId="77C49CBC" ns2:textId="77777777">
+          <w:p>
             <w:pPr>
               <w:rPr>
                 <w:rFonts w:ascii="宋体" w:hAnsi="宋体"/>
@@ -11367,7 +11367,7 @@
               <w:t xml:space="preserve"/>
             </w:r>
           </w:p>
-          <w:p ns2:paraId="19EAB8E2" ns2:textId="31DFF4F1">
+          <w:p>
             <w:pPr>
               <w:rPr>
                 <w:rFonts w:ascii="宋体" w:hAnsi="宋体"/>
@@ -11388,7 +11388,7 @@
             <w:tcW w:w="3977" w:type="dxa"/>
             <w:hideMark/>
           </w:tcPr>
-          <w:p ns2:paraId="2A7AD46C" ns2:textId="77777777">
+          <w:p>
             <w:pPr>
               <w:rPr>
                 <w:rFonts w:ascii="宋体" w:hAnsi="宋体"/>
@@ -11403,7 +11403,7 @@
               <w:t xml:space="preserve">项目教学</w:t>
             </w:r>
           </w:p>
-          <w:p ns2:paraId="782B8BFA" ns2:textId="77777777">
+          <w:p>
             <w:pPr>
               <w:rPr>
                 <w:rFonts w:ascii="宋体" w:hAnsi="宋体"/>
@@ -11418,7 +11418,7 @@
               <w:t xml:space="preserve">教师分阶段指导</w:t>
             </w:r>
           </w:p>
-          <w:p ns2:paraId="2EB0F7CB" ns2:textId="77777777">
+          <w:p>
             <w:pPr>
               <w:rPr>
                 <w:rFonts w:ascii="宋体" w:hAnsi="宋体"/>
@@ -11433,7 +11433,7 @@
               <w:t xml:space="preserve">小组展示、答辩与复盘</w:t>
             </w:r>
           </w:p>
-          <w:p ns2:paraId="7C1906AC" ns2:textId="77777777">
+          <w:p>
             <w:pPr>
               <w:rPr>
                 <w:rFonts w:ascii="宋体" w:hAnsi="宋体"/>
@@ -11448,7 +11448,7 @@
               <w:t xml:space="preserve">形成作品及过程记录。</w:t>
             </w:r>
           </w:p>
-          <w:p ns2:paraId="5CC373D7" ns2:textId="2FC030E2">
+          <w:p>
             <w:pPr>
               <w:rPr>
                 <w:rFonts w:ascii="宋体" w:hAnsi="宋体"/>
@@ -11511,7 +11511,7 @@
             <w:vAlign w:val="center"/>
             <w:hideMark/>
           </w:tcPr>
-          <w:p ns2:paraId="513FF2B8" ns2:textId="77777777">
+          <w:p>
             <w:pPr>
               <w:rPr>
                 <w:rFonts w:ascii="宋体" w:hAnsi="宋体"/>
@@ -11528,14 +11528,14 @@
           </w:p>
         </w:tc>
       </w:tr>
-      <w:tr ns2:paraId="5D352F12" ns2:textId="77777777">
+      <w:tr>
         <w:tc>
           <w:tcPr>
             <w:tcW w:w="0" w:type="auto"/>
             <w:vAlign w:val="center"/>
             <w:hideMark/>
           </w:tcPr>
-          <w:p ns2:paraId="094CD746" ns2:textId="77777777">
+          <w:p>
             <w:pPr>
               <w:jc w:val="left"/>
               <w:rPr>
@@ -11557,7 +11557,7 @@
             <w:tcW w:w="1780" w:type="dxa"/>
             <w:hideMark/>
           </w:tcPr>
-          <w:p ns2:paraId="63EB4E14" ns2:textId="77777777">
+          <w:p>
             <w:pPr>
               <w:rPr>
                 <w:rFonts w:ascii="宋体" w:hAnsi="宋体"/>
@@ -11578,7 +11578,7 @@
             <w:tcW w:w="2834" w:type="dxa"/>
             <w:hideMark/>
           </w:tcPr>
-          <w:p ns2:paraId="1CC334F7" ns2:textId="515A0004">
+          <w:p>
             <w:pPr>
               <w:rPr>
                 <w:rFonts w:ascii="宋体" w:hAnsi="宋体"/>
@@ -11621,7 +11621,7 @@
               <w:t/>
             </w:r>
           </w:p>
-          <w:p ns2:paraId="5E8E140D" ns2:textId="77777777">
+          <w:p>
             <w:pPr>
               <w:rPr>
                 <w:rFonts w:ascii="宋体" w:hAnsi="宋体"/>
@@ -11636,7 +11636,7 @@
               <w:t xml:space="preserve">修订作品</w:t>
             </w:r>
           </w:p>
-          <w:p ns2:paraId="311C0A7A" ns2:textId="41186603">
+          <w:p>
             <w:pPr>
               <w:rPr>
                 <w:rFonts w:ascii="宋体" w:hAnsi="宋体"/>
@@ -11672,7 +11672,7 @@
               <w:t/>
             </w:r>
           </w:p>
-          <w:p ns2:paraId="4989F075" ns2:textId="20789D02">
+          <w:p>
             <w:pPr>
               <w:rPr>
                 <w:rFonts w:ascii="宋体" w:hAnsi="宋体"/>
@@ -11708,7 +11708,7 @@
               <w:t/>
             </w:r>
           </w:p>
-          <w:p ns2:paraId="1DD64CFE" ns2:textId="0C60EAEF">
+          <w:p>
             <w:pPr>
               <w:rPr>
                 <w:rFonts w:ascii="宋体" w:hAnsi="宋体"/>
@@ -11744,7 +11744,7 @@
               <w:t/>
             </w:r>
           </w:p>
-          <w:p ns2:paraId="5FF5175F" ns2:textId="77777777">
+          <w:p>
             <w:pPr>
               <w:rPr>
                 <w:rFonts w:ascii="宋体" w:hAnsi="宋体"/>
@@ -11759,7 +11759,7 @@
               <w:t xml:space="preserve"/>
             </w:r>
           </w:p>
-          <w:p ns2:paraId="70AA014C" ns2:textId="0B40DD1A">
+          <w:p>
             <w:pPr>
               <w:rPr>
                 <w:rFonts w:ascii="宋体" w:hAnsi="宋体"/>
@@ -11795,7 +11795,7 @@
               <w:t/>
             </w:r>
           </w:p>
-          <w:p ns2:paraId="478A6D8D" ns2:textId="062546A6">
+          <w:p>
             <w:pPr>
               <w:rPr>
                 <w:rFonts w:ascii="宋体" w:hAnsi="宋体"/>
@@ -11831,7 +11831,7 @@
               <w:t/>
             </w:r>
           </w:p>
-          <w:p ns2:paraId="551F3134" ns2:textId="1B67806B">
+          <w:p>
             <w:pPr>
               <w:rPr>
                 <w:rFonts w:ascii="宋体" w:hAnsi="宋体"/>
@@ -11873,7 +11873,7 @@
             <w:tcW w:w="4111" w:type="dxa"/>
             <w:hideMark/>
           </w:tcPr>
-          <w:p ns2:paraId="318D2A19" ns2:textId="77777777">
+          <w:p>
             <w:pPr>
               <w:rPr>
                 <w:rFonts w:ascii="宋体" w:hAnsi="宋体"/>
@@ -11888,7 +11888,7 @@
               <w:t xml:space="preserve">能够根据反馈定位问题并完成一次有效迭代</w:t>
             </w:r>
           </w:p>
-          <w:p ns2:paraId="5D5A3900" ns2:textId="77777777">
+          <w:p>
             <w:pPr>
               <w:rPr>
                 <w:rFonts w:ascii="宋体" w:hAnsi="宋体"/>
@@ -11903,7 +11903,7 @@
               <w:t xml:space="preserve">能够给出具体、尊重的评价</w:t>
             </w:r>
           </w:p>
-          <w:p ns2:paraId="46023F64" ns2:textId="77777777">
+          <w:p>
             <w:pPr>
               <w:rPr>
                 <w:rFonts w:ascii="宋体" w:hAnsi="宋体"/>
@@ -11918,7 +11918,7 @@
               <w:t xml:space="preserve"/>
             </w:r>
           </w:p>
-          <w:p ns2:paraId="354EEE69" ns2:textId="77777777">
+          <w:p>
             <w:pPr>
               <w:rPr>
                 <w:rFonts w:ascii="宋体" w:hAnsi="宋体"/>
@@ -11933,7 +11933,7 @@
               <w:t xml:space="preserve"/>
             </w:r>
           </w:p>
-          <w:p ns2:paraId="28AF6CDC" ns2:textId="5F46AC5A">
+          <w:p>
             <w:pPr>
               <w:rPr>
                 <w:rFonts w:ascii="宋体" w:hAnsi="宋体"/>
@@ -11954,7 +11954,7 @@
             <w:tcW w:w="3977" w:type="dxa"/>
             <w:hideMark/>
           </w:tcPr>
-          <w:p ns2:paraId="61AFDEC4" ns2:textId="77777777">
+          <w:p>
             <w:pPr>
               <w:rPr>
                 <w:rFonts w:ascii="宋体" w:hAnsi="宋体"/>
@@ -11969,7 +11969,7 @@
               <w:t xml:space="preserve">同伴互评与教师点评</w:t>
             </w:r>
           </w:p>
-          <w:p ns2:paraId="6BBC44CF" ns2:textId="77777777">
+          <w:p>
             <w:pPr>
               <w:rPr>
                 <w:rFonts w:ascii="宋体" w:hAnsi="宋体"/>
@@ -11984,7 +11984,7 @@
               <w:t xml:space="preserve">记录修改前后差异。</w:t>
             </w:r>
           </w:p>
-          <w:p ns2:paraId="52E9213B" ns2:textId="77777777">
+          <w:p>
             <w:pPr>
               <w:rPr>
                 <w:rFonts w:ascii="宋体" w:hAnsi="宋体"/>
@@ -11999,7 +11999,7 @@
               <w:t xml:space="preserve"/>
             </w:r>
           </w:p>
-          <w:p ns2:paraId="026C852A" ns2:textId="77777777">
+          <w:p>
             <w:pPr>
               <w:rPr>
                 <w:rFonts w:ascii="宋体" w:hAnsi="宋体"/>
@@ -12014,7 +12014,7 @@
               <w:t xml:space="preserve"/>
             </w:r>
           </w:p>
-          <w:p ns2:paraId="0006B50F" ns2:textId="77777777">
+          <w:p>
             <w:pPr>
               <w:rPr>
                 <w:rFonts w:ascii="宋体" w:hAnsi="宋体"/>
@@ -12029,7 +12029,7 @@
               <w:t xml:space="preserve"/>
             </w:r>
           </w:p>
-          <w:p ns2:paraId="28E5BA00" ns2:textId="77777777">
+          <w:p>
             <w:pPr>
               <w:rPr>
                 <w:rFonts w:ascii="宋体" w:hAnsi="宋体"/>
@@ -12044,7 +12044,7 @@
               <w:t xml:space="preserve"/>
             </w:r>
           </w:p>
-          <w:p ns2:paraId="6CF00D02" ns2:textId="1861BFFD">
+          <w:p>
             <w:pPr>
               <w:rPr>
                 <w:rFonts w:ascii="宋体" w:hAnsi="宋体"/>
@@ -12075,7 +12075,7 @@
             <w:vAlign w:val="center"/>
             <w:hideMark/>
           </w:tcPr>
-          <w:p ns2:paraId="503004CE" ns2:textId="77777777">
+          <w:p>
             <w:pPr>
               <w:rPr>
                 <w:rFonts w:ascii="宋体" w:hAnsi="宋体"/>
@@ -12092,14 +12092,14 @@
           </w:p>
         </w:tc>
       </w:tr>
-      <w:tr ns2:paraId="558BD823" ns2:textId="77777777">
+      <w:tr>
         <w:tc>
           <w:tcPr>
             <w:tcW w:w="0" w:type="auto"/>
             <w:vAlign w:val="center"/>
             <w:hideMark/>
           </w:tcPr>
-          <w:p ns2:paraId="5C5BB661" ns2:textId="77777777">
+          <w:p>
             <w:pPr>
               <w:jc w:val="left"/>
               <w:rPr>
@@ -12121,7 +12121,7 @@
             <w:tcW w:w="1780" w:type="dxa"/>
             <w:hideMark/>
           </w:tcPr>
-          <w:p ns2:paraId="45709635" ns2:textId="77777777">
+          <w:p>
             <w:pPr>
               <w:rPr>
                 <w:rFonts w:ascii="宋体" w:hAnsi="宋体"/>
@@ -12142,7 +12142,7 @@
             <w:tcW w:w="2834" w:type="dxa"/>
             <w:hideMark/>
           </w:tcPr>
-          <w:p ns2:paraId="519141DE" ns2:textId="77777777">
+          <w:p>
             <w:pPr>
               <w:rPr>
                 <w:rFonts w:ascii="宋体" w:hAnsi="宋体"/>
@@ -12157,7 +12157,7 @@
               <w:t xml:space="preserve">作品归档</w:t>
             </w:r>
           </w:p>
-          <w:p ns2:paraId="19608777" ns2:textId="77777777">
+          <w:p>
             <w:pPr>
               <w:rPr>
                 <w:rFonts w:ascii="宋体" w:hAnsi="宋体"/>
@@ -12172,7 +12172,7 @@
               <w:t xml:space="preserve">技术与行业趋势</w:t>
             </w:r>
           </w:p>
-          <w:p ns2:paraId="696DFB32" ns2:textId="77777777">
+          <w:p>
             <w:pPr>
               <w:rPr>
                 <w:rFonts w:ascii="宋体" w:hAnsi="宋体"/>
@@ -12187,7 +12187,7 @@
               <w:t xml:space="preserve">个人学习计划</w:t>
             </w:r>
           </w:p>
-          <w:p ns2:paraId="394053F6" ns2:textId="77777777">
+          <w:p>
             <w:pPr>
               <w:rPr>
                 <w:rFonts w:ascii="宋体" w:hAnsi="宋体"/>
@@ -12202,7 +12202,7 @@
               <w:t xml:space="preserve">数字人应用边界</w:t>
             </w:r>
           </w:p>
-          <w:p ns2:paraId="0B3F4979" ns2:textId="3B4AA247">
+          <w:p>
             <w:pPr>
               <w:rPr>
                 <w:rFonts w:ascii="宋体" w:hAnsi="宋体"/>
@@ -12223,7 +12223,7 @@
             <w:tcW w:w="4111" w:type="dxa"/>
             <w:hideMark/>
           </w:tcPr>
-          <w:p ns2:paraId="3A6FB06D" ns2:textId="77777777">
+          <w:p>
             <w:pPr>
               <w:rPr>
                 <w:rFonts w:ascii="宋体" w:hAnsi="宋体"/>
@@ -12238,7 +12238,7 @@
               <w:t xml:space="preserve">能够总结制作流程与学习成果</w:t>
             </w:r>
           </w:p>
-          <w:p ns2:paraId="7194CEDF" ns2:textId="77777777">
+          <w:p>
             <w:pPr>
               <w:rPr>
                 <w:rFonts w:ascii="宋体" w:hAnsi="宋体"/>
@@ -12253,7 +12253,7 @@
               <w:t xml:space="preserve">能够提出后续提升计划并遵守持续更新要求</w:t>
             </w:r>
           </w:p>
-          <w:p ns2:paraId="1A806F93" ns2:textId="77777777">
+          <w:p>
             <w:pPr>
               <w:rPr>
                 <w:rFonts w:ascii="宋体" w:hAnsi="宋体"/>
@@ -12268,7 +12268,7 @@
               <w:t xml:space="preserve"/>
             </w:r>
           </w:p>
-          <w:p ns2:paraId="1345DEFA" ns2:textId="77777777">
+          <w:p>
             <w:pPr>
               <w:rPr>
                 <w:rFonts w:ascii="宋体" w:hAnsi="宋体"/>
@@ -12283,7 +12283,7 @@
               <w:t xml:space="preserve"/>
             </w:r>
           </w:p>
-          <w:p ns2:paraId="15F24EBF" ns2:textId="4C452268">
+          <w:p>
             <w:pPr>
               <w:rPr>
                 <w:rFonts w:ascii="宋体" w:hAnsi="宋体"/>
@@ -12304,7 +12304,7 @@
             <w:tcW w:w="3977" w:type="dxa"/>
             <w:hideMark/>
           </w:tcPr>
-          <w:p ns2:paraId="4A7F208D" ns2:textId="77777777">
+          <w:p>
             <w:pPr>
               <w:rPr>
                 <w:rFonts w:ascii="宋体" w:hAnsi="宋体"/>
@@ -12319,7 +12319,7 @@
               <w:t xml:space="preserve">成果展映、经验交流、学习反思。思政融入：树立诚信表达与终身学习意识。</w:t>
             </w:r>
           </w:p>
-          <w:p ns2:paraId="3CE26669" ns2:textId="77777777">
+          <w:p>
             <w:pPr>
               <w:rPr>
                 <w:rFonts w:ascii="宋体" w:hAnsi="宋体"/>
@@ -12334,7 +12334,7 @@
               <w:t xml:space="preserve"/>
             </w:r>
           </w:p>
-          <w:p ns2:paraId="41C27533" ns2:textId="77777777">
+          <w:p>
             <w:pPr>
               <w:rPr>
                 <w:rFonts w:ascii="宋体" w:hAnsi="宋体"/>
@@ -12349,7 +12349,7 @@
               <w:t xml:space="preserve"/>
             </w:r>
           </w:p>
-          <w:p ns2:paraId="788C139C" ns2:textId="77777777">
+          <w:p>
             <w:pPr>
               <w:rPr>
                 <w:rFonts w:ascii="宋体" w:hAnsi="宋体"/>
@@ -12364,7 +12364,7 @@
               <w:t xml:space="preserve"/>
             </w:r>
           </w:p>
-          <w:p ns2:paraId="1C565ABA" ns2:textId="77777777">
+          <w:p>
             <w:pPr>
               <w:rPr>
                 <w:rFonts w:ascii="宋体" w:hAnsi="宋体"/>
@@ -12379,7 +12379,7 @@
               <w:t xml:space="preserve"/>
             </w:r>
           </w:p>
-          <w:p ns2:paraId="0BC3BA2D" ns2:textId="519F8FD7">
+          <w:p>
             <w:pPr>
               <w:rPr>
                 <w:rFonts w:ascii="宋体" w:hAnsi="宋体"/>
@@ -12411,7 +12411,7 @@
             <w:vAlign w:val="center"/>
             <w:hideMark/>
           </w:tcPr>
-          <w:p ns2:paraId="6EC9FA15" ns2:textId="77777777">
+          <w:p>
             <w:pPr>
               <w:rPr>
                 <w:rFonts w:ascii="宋体" w:hAnsi="宋体"/>
@@ -12430,7 +12430,7 @@
         </w:tc>
       </w:tr>
     </w:tbl>
-    <w:p ns2:paraId="52AC6BB0" ns2:textId="2AF8BD2C">
+    <w:p>
       <w:pPr>
         <w:pStyle w:val="2"/>
         <w:spacing w:line="500" w:lineRule="exact"/>
@@ -12474,7 +12474,7 @@
         <w:t/>
       </w:r>
     </w:p>
-    <w:p ns2:paraId="3BAC1807" ns2:textId="77777777">
+    <w:p>
       <w:pPr>
         <w:pStyle w:val="2"/>
         <w:spacing w:line="500" w:lineRule="exact"/>
@@ -12486,7 +12486,7 @@
         </w:rPr>
       </w:pPr>
     </w:p>
-    <w:p ns2:paraId="2E0F18BF" ns2:textId="54229D42">
+    <w:p>
       <w:pPr>
         <w:adjustRightInd w:val="0"/>
         <w:snapToGrid w:val="0"/>
@@ -12522,14 +12522,14 @@
         <w:gridCol w:w="2496"/>
         <w:gridCol w:w="1834"/>
       </w:tblGrid>
-      <w:tr ns2:paraId="4F56068D" ns2:textId="77777777">
+      <w:tr>
         <w:tc>
           <w:tcPr>
             <w:tcW w:w="0" w:type="auto"/>
             <w:vAlign w:val="center"/>
             <w:hideMark/>
           </w:tcPr>
-          <w:p ns2:paraId="05560E9A" ns2:textId="77777777">
+          <w:p>
             <w:pPr>
               <w:pStyle w:val="2"/>
               <w:spacing w:line="500" w:lineRule="exact"/>
@@ -12560,7 +12560,7 @@
             <w:vAlign w:val="center"/>
             <w:hideMark/>
           </w:tcPr>
-          <w:p ns2:paraId="517ADC99" ns2:textId="77777777">
+          <w:p>
             <w:pPr>
               <w:pStyle w:val="2"/>
               <w:spacing w:line="500" w:lineRule="exact"/>
@@ -12591,7 +12591,7 @@
             <w:vAlign w:val="center"/>
             <w:hideMark/>
           </w:tcPr>
-          <w:p ns2:paraId="716DAB53" ns2:textId="77777777">
+          <w:p>
             <w:pPr>
               <w:pStyle w:val="2"/>
               <w:spacing w:line="500" w:lineRule="exact"/>
@@ -12622,7 +12622,7 @@
             <w:vAlign w:val="center"/>
             <w:hideMark/>
           </w:tcPr>
-          <w:p ns2:paraId="175295E0" ns2:textId="77777777">
+          <w:p>
             <w:pPr>
               <w:pStyle w:val="2"/>
               <w:spacing w:line="500" w:lineRule="exact"/>
@@ -12665,7 +12665,7 @@
             <w:vAlign w:val="center"/>
             <w:hideMark/>
           </w:tcPr>
-          <w:p ns2:paraId="564C7CA1" ns2:textId="77777777">
+          <w:p>
             <w:pPr>
               <w:pStyle w:val="2"/>
               <w:spacing w:line="500" w:lineRule="exact"/>
@@ -12691,14 +12691,14 @@
           </w:p>
         </w:tc>
       </w:tr>
-      <w:tr ns2:paraId="7B4026E9" ns2:textId="77777777">
+      <w:tr>
         <w:tc>
           <w:tcPr>
             <w:tcW w:w="0" w:type="auto"/>
             <w:vAlign w:val="center"/>
             <w:hideMark/>
           </w:tcPr>
-          <w:p ns2:paraId="324635CD" ns2:textId="77777777">
+          <w:p>
             <w:pPr>
               <w:pStyle w:val="2"/>
               <w:spacing w:line="500" w:lineRule="exact"/>
@@ -12725,7 +12725,7 @@
             <w:vAlign w:val="center"/>
             <w:hideMark/>
           </w:tcPr>
-          <w:p ns2:paraId="4A8AC680" ns2:textId="77777777">
+          <w:p>
             <w:pPr>
               <w:pStyle w:val="2"/>
               <w:spacing w:line="500" w:lineRule="exact"/>
@@ -12752,7 +12752,7 @@
             <w:vAlign w:val="center"/>
             <w:hideMark/>
           </w:tcPr>
-          <w:p ns2:paraId="48EDEBD9" ns2:textId="77777777">
+          <w:p>
             <w:pPr>
               <w:pStyle w:val="2"/>
               <w:spacing w:line="500" w:lineRule="exact"/>
@@ -12779,7 +12779,7 @@
             <w:vAlign w:val="center"/>
             <w:hideMark/>
           </w:tcPr>
-          <w:p ns2:paraId="6A7DCB61" ns2:textId="77777777">
+          <w:p>
             <w:pPr>
               <w:pStyle w:val="2"/>
               <w:spacing w:line="500" w:lineRule="exact"/>
@@ -12806,7 +12806,7 @@
             <w:vAlign w:val="center"/>
             <w:hideMark/>
           </w:tcPr>
-          <w:p ns2:paraId="76F0497D" ns2:textId="77777777">
+          <w:p>
             <w:pPr>
               <w:pStyle w:val="2"/>
               <w:spacing w:line="500" w:lineRule="exact"/>
@@ -12846,14 +12846,14 @@
           </w:p>
         </w:tc>
       </w:tr>
-      <w:tr ns2:paraId="34FD49F8" ns2:textId="77777777">
+      <w:tr>
         <w:tc>
           <w:tcPr>
             <w:tcW w:w="0" w:type="auto"/>
             <w:vAlign w:val="center"/>
             <w:hideMark/>
           </w:tcPr>
-          <w:p ns2:paraId="6721A510" ns2:textId="77777777">
+          <w:p>
             <w:pPr>
               <w:pStyle w:val="2"/>
               <w:spacing w:line="500" w:lineRule="exact"/>
@@ -12882,7 +12882,7 @@
             <w:vAlign w:val="center"/>
             <w:hideMark/>
           </w:tcPr>
-          <w:p ns2:paraId="10C650B9" ns2:textId="77777777">
+          <w:p>
             <w:pPr>
               <w:pStyle w:val="2"/>
               <w:spacing w:line="500" w:lineRule="exact"/>
@@ -12909,7 +12909,7 @@
             <w:vAlign w:val="center"/>
             <w:hideMark/>
           </w:tcPr>
-          <w:p ns2:paraId="231390FE" ns2:textId="77777777">
+          <w:p>
             <w:pPr>
               <w:pStyle w:val="2"/>
               <w:spacing w:line="500" w:lineRule="exact"/>
@@ -12936,7 +12936,7 @@
             <w:vAlign w:val="center"/>
             <w:hideMark/>
           </w:tcPr>
-          <w:p ns2:paraId="40AE1433" ns2:textId="77777777">
+          <w:p>
             <w:pPr>
               <w:pStyle w:val="2"/>
               <w:spacing w:line="500" w:lineRule="exact"/>
@@ -12963,7 +12963,7 @@
             <w:vAlign w:val="center"/>
             <w:hideMark/>
           </w:tcPr>
-          <w:p ns2:paraId="7149BDA5" ns2:textId="77777777">
+          <w:p>
             <w:pPr>
               <w:pStyle w:val="2"/>
               <w:spacing w:line="500" w:lineRule="exact"/>
@@ -13003,14 +13003,14 @@
           </w:p>
         </w:tc>
       </w:tr>
-      <w:tr ns2:paraId="6961E029" ns2:textId="77777777">
+      <w:tr>
         <w:tc>
           <w:tcPr>
             <w:tcW w:w="0" w:type="auto"/>
             <w:vAlign w:val="center"/>
             <w:hideMark/>
           </w:tcPr>
-          <w:p ns2:paraId="740B7FA4" ns2:textId="77777777">
+          <w:p>
             <w:pPr>
               <w:pStyle w:val="2"/>
               <w:spacing w:line="500" w:lineRule="exact"/>
@@ -13037,7 +13037,7 @@
             <w:vAlign w:val="center"/>
             <w:hideMark/>
           </w:tcPr>
-          <w:p ns2:paraId="782C9A88" ns2:textId="77777777">
+          <w:p>
             <w:pPr>
               <w:pStyle w:val="2"/>
               <w:spacing w:line="500" w:lineRule="exact"/>
@@ -13064,7 +13064,7 @@
             <w:vAlign w:val="center"/>
             <w:hideMark/>
           </w:tcPr>
-          <w:p ns2:paraId="6231393B" ns2:textId="77777777">
+          <w:p>
             <w:pPr>
               <w:pStyle w:val="2"/>
               <w:spacing w:line="500" w:lineRule="exact"/>
@@ -13091,7 +13091,7 @@
             <w:vAlign w:val="center"/>
             <w:hideMark/>
           </w:tcPr>
-          <w:p ns2:paraId="156D86F2" ns2:textId="77777777">
+          <w:p>
             <w:pPr>
               <w:pStyle w:val="2"/>
               <w:spacing w:line="500" w:lineRule="exact"/>
@@ -13118,7 +13118,7 @@
             <w:vAlign w:val="center"/>
             <w:hideMark/>
           </w:tcPr>
-          <w:p ns2:paraId="25DEA4B8" ns2:textId="77777777">
+          <w:p>
             <w:pPr>
               <w:pStyle w:val="2"/>
               <w:spacing w:line="500" w:lineRule="exact"/>
@@ -13158,14 +13158,14 @@
           </w:p>
         </w:tc>
       </w:tr>
-      <w:tr ns2:paraId="3FFCD681" ns2:textId="77777777">
+      <w:tr>
         <w:tc>
           <w:tcPr>
             <w:tcW w:w="0" w:type="auto"/>
             <w:vAlign w:val="center"/>
             <w:hideMark/>
           </w:tcPr>
-          <w:p ns2:paraId="6AE1835F" ns2:textId="77777777">
+          <w:p>
             <w:pPr>
               <w:pStyle w:val="2"/>
               <w:spacing w:line="500" w:lineRule="exact"/>
@@ -13192,7 +13192,7 @@
             <w:vAlign w:val="center"/>
             <w:hideMark/>
           </w:tcPr>
-          <w:p ns2:paraId="6879C4BA" ns2:textId="77777777">
+          <w:p>
             <w:pPr>
               <w:pStyle w:val="2"/>
               <w:spacing w:line="500" w:lineRule="exact"/>
@@ -13219,7 +13219,7 @@
             <w:vAlign w:val="center"/>
             <w:hideMark/>
           </w:tcPr>
-          <w:p ns2:paraId="227CFF18" ns2:textId="77777777">
+          <w:p>
             <w:pPr>
               <w:pStyle w:val="2"/>
               <w:spacing w:line="500" w:lineRule="exact"/>
@@ -13246,7 +13246,7 @@
             <w:vAlign w:val="center"/>
             <w:hideMark/>
           </w:tcPr>
-          <w:p ns2:paraId="3053084C" ns2:textId="77777777">
+          <w:p>
             <w:pPr>
               <w:pStyle w:val="2"/>
               <w:spacing w:line="500" w:lineRule="exact"/>
@@ -13273,7 +13273,7 @@
             <w:vAlign w:val="center"/>
             <w:hideMark/>
           </w:tcPr>
-          <w:p ns2:paraId="7C721782" ns2:textId="77777777">
+          <w:p>
             <w:pPr>
               <w:pStyle w:val="2"/>
               <w:spacing w:line="500" w:lineRule="exact"/>
@@ -13313,14 +13313,14 @@
           </w:p>
         </w:tc>
       </w:tr>
-      <w:tr ns2:paraId="63F81937" ns2:textId="77777777">
+      <w:tr>
         <w:tc>
           <w:tcPr>
             <w:tcW w:w="0" w:type="auto"/>
             <w:vAlign w:val="center"/>
             <w:hideMark/>
           </w:tcPr>
-          <w:p ns2:paraId="61BDEB80" ns2:textId="77777777">
+          <w:p>
             <w:pPr>
               <w:pStyle w:val="2"/>
               <w:spacing w:line="500" w:lineRule="exact"/>
@@ -13347,7 +13347,7 @@
             <w:vAlign w:val="center"/>
             <w:hideMark/>
           </w:tcPr>
-          <w:p ns2:paraId="4E008922" ns2:textId="77777777">
+          <w:p>
             <w:pPr>
               <w:pStyle w:val="2"/>
               <w:spacing w:line="500" w:lineRule="exact"/>
@@ -13374,7 +13374,7 @@
             <w:vAlign w:val="center"/>
             <w:hideMark/>
           </w:tcPr>
-          <w:p ns2:paraId="0599ABF5" ns2:textId="77777777">
+          <w:p>
             <w:pPr>
               <w:pStyle w:val="2"/>
               <w:spacing w:line="500" w:lineRule="exact"/>
@@ -13401,7 +13401,7 @@
             <w:vAlign w:val="center"/>
             <w:hideMark/>
           </w:tcPr>
-          <w:p ns2:paraId="736677DE" ns2:textId="77777777">
+          <w:p>
             <w:pPr>
               <w:pStyle w:val="2"/>
               <w:spacing w:line="500" w:lineRule="exact"/>
@@ -13428,7 +13428,7 @@
             <w:vAlign w:val="center"/>
             <w:hideMark/>
           </w:tcPr>
-          <w:p ns2:paraId="3D1183BF" ns2:textId="77777777">
+          <w:p>
             <w:pPr>
               <w:pStyle w:val="2"/>
               <w:spacing w:line="500" w:lineRule="exact"/>
@@ -13468,14 +13468,14 @@
           </w:p>
         </w:tc>
       </w:tr>
-      <w:tr ns2:paraId="5417D072" ns2:textId="77777777">
+      <w:tr>
         <w:tc>
           <w:tcPr>
             <w:tcW w:w="0" w:type="auto"/>
             <w:vAlign w:val="center"/>
             <w:hideMark/>
           </w:tcPr>
-          <w:p ns2:paraId="3FEC4339" ns2:textId="77777777">
+          <w:p>
             <w:pPr>
               <w:pStyle w:val="2"/>
               <w:spacing w:line="500" w:lineRule="exact"/>
@@ -13505,7 +13505,7 @@
             <w:vAlign w:val="center"/>
             <w:hideMark/>
           </w:tcPr>
-          <w:p ns2:paraId="65DBBF4A" ns2:textId="77777777">
+          <w:p>
             <w:pPr>
               <w:pStyle w:val="2"/>
               <w:spacing w:line="500" w:lineRule="exact"/>
@@ -13532,7 +13532,7 @@
             <w:vAlign w:val="center"/>
             <w:hideMark/>
           </w:tcPr>
-          <w:p ns2:paraId="3A467511" ns2:textId="34A7870E">
+          <w:p>
             <w:pPr>
               <w:pStyle w:val="2"/>
               <w:spacing w:line="500" w:lineRule="exact"/>
@@ -13583,7 +13583,7 @@
             <w:vAlign w:val="center"/>
             <w:hideMark/>
           </w:tcPr>
-          <w:p ns2:paraId="3C05D854" ns2:textId="77777777">
+          <w:p>
             <w:pPr>
               <w:pStyle w:val="2"/>
               <w:spacing w:line="500" w:lineRule="exact"/>
@@ -13610,7 +13610,7 @@
             <w:vAlign w:val="center"/>
             <w:hideMark/>
           </w:tcPr>
-          <w:p ns2:paraId="4748EF79" ns2:textId="77777777">
+          <w:p>
             <w:pPr>
               <w:pStyle w:val="2"/>
               <w:spacing w:line="500" w:lineRule="exact"/>
@@ -13651,7 +13651,7 @@
         </w:tc>
       </w:tr>
     </w:tbl>
-    <w:p ns2:paraId="6FD55D4A" ns2:textId="77777777">
+    <w:p>
       <w:pPr>
         <w:pStyle w:val="2"/>
         <w:spacing w:line="500" w:lineRule="exact"/>
@@ -13664,7 +13664,7 @@
       </w:pPr>
     </w:p>
     <w:bookmarkEnd w:id="1"/>
-    <w:p ns2:paraId="603C5F52" ns2:textId="77777777"/>
+    <w:p/>
     <w:sectPr>
       <w:pgSz w:w="16838" w:h="11906" w:orient="landscape"/>
       <w:pgMar w:top="1800" w:right="1440" w:bottom="1800" w:left="1440" w:header="851" w:footer="992" w:gutter="0"/>

</xml_diff>